<commit_message>
docs: refine final technical report
</commit_message>
<xml_diff>
--- a/docs/Informe_Tecnico_Redes_Neuronales.docx
+++ b/docs/Informe_Tecnico_Redes_Neuronales.docx
@@ -31,7 +31,23 @@
           <w:sz w:val="24"/>
           <w:szCs w:val="24"/>
         </w:rPr>
-        <w:t>Facultad de Ingeniería — Ingeniería de Sistemas e IA</w:t>
+        <w:t xml:space="preserve">Facultad de Ingeniería — </w:t>
+      </w:r>
+      <w:r>
+        <w:rPr>
+          <w:color w:val="2E75B6"/>
+          <w:sz w:val="24"/>
+          <w:szCs w:val="24"/>
+        </w:rPr>
+        <w:t>Ciencias de la Computación</w:t>
+      </w:r>
+      <w:r>
+        <w:rPr>
+          <w:color w:val="2E75B6"/>
+          <w:sz w:val="24"/>
+          <w:szCs w:val="24"/>
+        </w:rPr>
+        <w:t xml:space="preserve"> e IA</w:t>
       </w:r>
     </w:p>
     <w:p>
@@ -423,14 +439,7 @@
                 <w:sz w:val="20"/>
                 <w:szCs w:val="20"/>
               </w:rPr>
-              <w:t>5/05/</w:t>
-            </w:r>
-            <w:r>
-              <w:rPr>
-                <w:sz w:val="20"/>
-                <w:szCs w:val="20"/>
-              </w:rPr>
-              <w:t>2026</w:t>
+              <w:t>5/05/2026</w:t>
             </w:r>
           </w:p>
         </w:tc>
@@ -459,21 +468,7 @@
         <w:rPr>
           <w:color w:val="000000"/>
         </w:rPr>
-        <w:t xml:space="preserve">El presente informe técnico documenta el desarrollo de un sistema de clasificación de patrones de imágenes basado en el modelo de Regresión Logística, con el objetivo central de comparar el rendimiento entre una implementación de alto nivel en Python usando </w:t>
-      </w:r>
-      <w:proofErr w:type="spellStart"/>
-      <w:r>
-        <w:rPr>
-          <w:color w:val="000000"/>
-        </w:rPr>
-        <w:t>Scikit</w:t>
-      </w:r>
-      <w:proofErr w:type="spellEnd"/>
-      <w:r>
-        <w:rPr>
-          <w:color w:val="000000"/>
-        </w:rPr>
-        <w:t>-Learn y una implementación de bajo nivel optimizada en C++ mediante la biblioteca de álgebra lineal Eigen.</w:t>
+        <w:t>El presente informe técnico documenta el desarrollo de un sistema de clasificación de patrones de imágenes basado en el modelo de Regresión Logística, con el objetivo central de comparar el rendimiento entre una implementación de alto nivel en Python usando Scikit-Learn y una implementación de bajo nivel optimizada en C++ mediante la biblioteca de álgebra lineal Eigen.</w:t>
       </w:r>
     </w:p>
     <w:p>
@@ -485,35 +480,7 @@
         <w:rPr>
           <w:color w:val="000000"/>
         </w:rPr>
-        <w:t xml:space="preserve">El </w:t>
-      </w:r>
-      <w:proofErr w:type="spellStart"/>
-      <w:r>
-        <w:rPr>
-          <w:color w:val="000000"/>
-        </w:rPr>
-        <w:t>dataset</w:t>
-      </w:r>
-      <w:proofErr w:type="spellEnd"/>
-      <w:r>
-        <w:rPr>
-          <w:color w:val="000000"/>
-        </w:rPr>
-        <w:t xml:space="preserve"> seleccionado corresponde al subconjunto binario del famoso </w:t>
-      </w:r>
-      <w:proofErr w:type="spellStart"/>
-      <w:r>
-        <w:rPr>
-          <w:color w:val="000000"/>
-        </w:rPr>
-        <w:t>dataset</w:t>
-      </w:r>
-      <w:proofErr w:type="spellEnd"/>
-      <w:r>
-        <w:rPr>
-          <w:color w:val="000000"/>
-        </w:rPr>
-        <w:t xml:space="preserve"> MNIST, específicamente los dígitos 3 y 8, que totalizan aproximadamente 13.966 imágenes de 28×28 píxeles en escala de grises. Esta selección se justifica por la similitud morfológica entre ambos dígitos, que representa un reto suficientemente desafiante para un clasificador lineal sin ser trivialmente irresoluble.</w:t>
+        <w:t>El dataset seleccionado corresponde al subconjunto binario del famoso dataset MNIST, específicamente los dígitos 3 y 8, que totalizan aproximadamente 13.966 imágenes de 28×28 píxeles en escala de grises. Esta selección se justifica por la similitud morfológica entre ambos dígitos, que representa un reto suficientemente desafiante para un clasificador lineal sin ser trivialmente irresoluble.</w:t>
       </w:r>
     </w:p>
     <w:p>
@@ -525,7 +492,7 @@
         <w:rPr>
           <w:color w:val="000000"/>
         </w:rPr>
-        <w:t>Los resultados demuestran que ambas implementaciones alcanzan métricas de clasificación superiores al 96%, con ventajas complementarias: Python ofrece convergencia más rápida gracias al optimizador L-BFGS, mientras que C++ sobresale en eficiencia de memoria, consumiendo aproximadamente 26 veces menos RAM que el proceso Python equivalente.</w:t>
+        <w:t>Los resultados demuestran que ambas implementaciones alcanzan métricas de clasificación superiores al 96%, con ventajas complementarias: Python ofrece convergencia más rápida gracias al optimizador L-BFGS, mientras que C++ sobresale en eficiencia de memoria, consumiendo aproximadamente 4.48 veces menos RAM que el proceso Python equivalente.</w:t>
       </w:r>
     </w:p>
     <w:p/>
@@ -554,21 +521,7 @@
         <w:rPr>
           <w:color w:val="000000"/>
         </w:rPr>
-        <w:t>La clasificación de imágenes constituye uno de los problemas centrales del aprendizaje automático moderno. Si bien las redes neuronales profundas dominan este dominio, los modelos clásicos como la Regresión Logística siguen siendo fundamentales tanto para establecer líneas base robustas (</w:t>
-      </w:r>
-      <w:proofErr w:type="spellStart"/>
-      <w:r>
-        <w:rPr>
-          <w:color w:val="000000"/>
-        </w:rPr>
-        <w:t>baselines</w:t>
-      </w:r>
-      <w:proofErr w:type="spellEnd"/>
-      <w:r>
-        <w:rPr>
-          <w:color w:val="000000"/>
-        </w:rPr>
-        <w:t>) como para comprender los principios matemáticos que subyacen a métodos más complejos.</w:t>
+        <w:t>La clasificación de imágenes constituye uno de los problemas centrales del aprendizaje automático moderno. Si bien las redes neuronales profundas dominan este dominio, los modelos clásicos como la Regresión Logística siguen siendo fundamentales tanto para establecer líneas base robustas (baselines) como para comprender los principios matemáticos que subyacen a métodos más complejos.</w:t>
       </w:r>
     </w:p>
     <w:p>
@@ -580,63 +533,7 @@
         <w:rPr>
           <w:color w:val="000000"/>
         </w:rPr>
-        <w:t>El estudio comparativo entre implementaciones de alto y bajo nivel es de especial relevancia en el contexto de sistemas embebidos, dispositivos de borde (</w:t>
-      </w:r>
-      <w:proofErr w:type="spellStart"/>
-      <w:r>
-        <w:rPr>
-          <w:color w:val="000000"/>
-        </w:rPr>
-        <w:t>edge</w:t>
-      </w:r>
-      <w:proofErr w:type="spellEnd"/>
-      <w:r>
-        <w:rPr>
-          <w:color w:val="000000"/>
-        </w:rPr>
-        <w:t xml:space="preserve"> </w:t>
-      </w:r>
-      <w:proofErr w:type="spellStart"/>
-      <w:r>
-        <w:rPr>
-          <w:color w:val="000000"/>
-        </w:rPr>
-        <w:t>computing</w:t>
-      </w:r>
-      <w:proofErr w:type="spellEnd"/>
-      <w:r>
-        <w:rPr>
-          <w:color w:val="000000"/>
-        </w:rPr>
-        <w:t xml:space="preserve">) y aplicaciones donde los recursos computacionales son limitados. En estos escenarios, una </w:t>
-      </w:r>
-      <w:proofErr w:type="spellStart"/>
-      <w:r>
-        <w:rPr>
-          <w:color w:val="000000"/>
-        </w:rPr>
-        <w:t>implementacion</w:t>
-      </w:r>
-      <w:proofErr w:type="spellEnd"/>
-      <w:r>
-        <w:rPr>
-          <w:color w:val="000000"/>
-        </w:rPr>
-        <w:t xml:space="preserve"> C++ bien optimizada puede ser una alternativa viable frente al </w:t>
-      </w:r>
-      <w:proofErr w:type="spellStart"/>
-      <w:r>
-        <w:rPr>
-          <w:color w:val="000000"/>
-        </w:rPr>
-        <w:t>overhead</w:t>
-      </w:r>
-      <w:proofErr w:type="spellEnd"/>
-      <w:r>
-        <w:rPr>
-          <w:color w:val="000000"/>
-        </w:rPr>
-        <w:t xml:space="preserve"> de Python.</w:t>
+        <w:t>El estudio comparativo entre implementaciones de alto y bajo nivel es de especial relevancia en el contexto de sistemas embebidos, dispositivos de borde (edge computing) y aplicaciones donde los recursos computacionales son limitados. En estos escenarios, una implementación C++ bien optimizada puede ser una alternativa viable frente al overhead de Python.</w:t>
       </w:r>
     </w:p>
     <w:p>
@@ -652,7 +549,7 @@
         <w:pStyle w:val="ListParagraph"/>
         <w:numPr>
           <w:ilvl w:val="0"/>
-          <w:numId w:val="2"/>
+          <w:numId w:val="3"/>
         </w:numPr>
         <w:spacing w:after="80"/>
       </w:pPr>
@@ -673,7 +570,7 @@
         <w:pStyle w:val="ListParagraph"/>
         <w:numPr>
           <w:ilvl w:val="0"/>
-          <w:numId w:val="2"/>
+          <w:numId w:val="3"/>
         </w:numPr>
         <w:spacing w:after="80"/>
       </w:pPr>
@@ -686,7 +583,7 @@
         <w:pStyle w:val="ListParagraph"/>
         <w:numPr>
           <w:ilvl w:val="0"/>
-          <w:numId w:val="2"/>
+          <w:numId w:val="3"/>
         </w:numPr>
         <w:spacing w:after="80"/>
       </w:pPr>
@@ -699,7 +596,7 @@
         <w:pStyle w:val="ListParagraph"/>
         <w:numPr>
           <w:ilvl w:val="0"/>
-          <w:numId w:val="2"/>
+          <w:numId w:val="3"/>
         </w:numPr>
         <w:spacing w:after="80"/>
       </w:pPr>
@@ -712,7 +609,7 @@
         <w:pStyle w:val="ListParagraph"/>
         <w:numPr>
           <w:ilvl w:val="0"/>
-          <w:numId w:val="2"/>
+          <w:numId w:val="3"/>
         </w:numPr>
         <w:spacing w:after="80"/>
       </w:pPr>
@@ -1082,49 +979,7 @@
         <w:rPr>
           <w:color w:val="000000"/>
         </w:rPr>
-        <w:t>Eigen es una biblioteca C++ de cabecera única (</w:t>
-      </w:r>
-      <w:proofErr w:type="spellStart"/>
-      <w:r>
-        <w:rPr>
-          <w:color w:val="000000"/>
-        </w:rPr>
-        <w:t>header-only</w:t>
-      </w:r>
-      <w:proofErr w:type="spellEnd"/>
-      <w:r>
-        <w:rPr>
-          <w:color w:val="000000"/>
-        </w:rPr>
-        <w:t>) para álgebra lineal numérica. Proporciona tipos de matrices y vectores con aritmética eficiente que explota automáticamente instrucciones SIMD (SSE, AVX) y la localidad de caché mediante el ordenamiento por columnas (</w:t>
-      </w:r>
-      <w:proofErr w:type="spellStart"/>
-      <w:r>
-        <w:rPr>
-          <w:color w:val="000000"/>
-        </w:rPr>
-        <w:t>Column-Major</w:t>
-      </w:r>
-      <w:proofErr w:type="spellEnd"/>
-      <w:r>
-        <w:rPr>
-          <w:color w:val="000000"/>
-        </w:rPr>
-        <w:t xml:space="preserve">) de sus matrices. Esto la convierte en una biblioteca ampliamente usada para implementaciones de bajo nivel y prototipos </w:t>
-      </w:r>
-      <w:proofErr w:type="spellStart"/>
-      <w:r>
-        <w:rPr>
-          <w:color w:val="000000"/>
-        </w:rPr>
-        <w:t>numericos</w:t>
-      </w:r>
-      <w:proofErr w:type="spellEnd"/>
-      <w:r>
-        <w:rPr>
-          <w:color w:val="000000"/>
-        </w:rPr>
-        <w:t xml:space="preserve"> eficientes.</w:t>
+        <w:t>Eigen es una biblioteca C++ header-only para álgebra lineal numérica. Proporciona tipos de matrices y vectores con aritmética eficiente que puede aprovechar instrucciones SIMD (SSE, AVX) y patrones de acceso contiguos cuando las operaciones respetan el orden de almacenamiento de sus matrices. Esto la convierte en una biblioteca ampliamente usada para implementaciones de bajo nivel y prototipos numéricos eficientes.</w:t>
       </w:r>
     </w:p>
     <w:p>
@@ -1144,63 +999,7 @@
         <w:rPr>
           <w:color w:val="000000"/>
         </w:rPr>
-        <w:t xml:space="preserve">El procesamiento eficiente de matrices de imagen requiere considerar la localidad espacial y temporal en memoria. Eigen almacena matrices en orden </w:t>
-      </w:r>
-      <w:proofErr w:type="spellStart"/>
-      <w:r>
-        <w:rPr>
-          <w:color w:val="000000"/>
-        </w:rPr>
-        <w:t>Column-Major</w:t>
-      </w:r>
-      <w:proofErr w:type="spellEnd"/>
-      <w:r>
-        <w:rPr>
-          <w:color w:val="000000"/>
-        </w:rPr>
-        <w:t xml:space="preserve"> por defecto, lo que implica que las operaciones por columnas son más eficientes que por filas en términos de caché. Para el </w:t>
-      </w:r>
-      <w:proofErr w:type="spellStart"/>
-      <w:r>
-        <w:rPr>
-          <w:color w:val="000000"/>
-        </w:rPr>
-        <w:t>dataset</w:t>
-      </w:r>
-      <w:proofErr w:type="spellEnd"/>
-      <w:r>
-        <w:rPr>
-          <w:color w:val="000000"/>
-        </w:rPr>
-        <w:t xml:space="preserve"> MNIST, donde cada fila representa una imagen de 784 píxeles, la multiplicación matricial </w:t>
-      </w:r>
-      <w:proofErr w:type="spellStart"/>
-      <w:r>
-        <w:rPr>
-          <w:color w:val="000000"/>
-        </w:rPr>
-        <w:t>X·w</w:t>
-      </w:r>
-      <w:proofErr w:type="spellEnd"/>
-      <w:r>
-        <w:rPr>
-          <w:color w:val="000000"/>
-        </w:rPr>
-        <w:t xml:space="preserve"> accede a las filas de X secuencialmente, lo que es favorable para la localidad espacial (</w:t>
-      </w:r>
-      <w:proofErr w:type="spellStart"/>
-      <w:r>
-        <w:rPr>
-          <w:color w:val="000000"/>
-        </w:rPr>
-        <w:t>prefetcher</w:t>
-      </w:r>
-      <w:proofErr w:type="spellEnd"/>
-      <w:r>
-        <w:rPr>
-          <w:color w:val="000000"/>
-        </w:rPr>
-        <w:t xml:space="preserve"> de caché).</w:t>
+        <w:t>El procesamiento eficiente de matrices de imagen requiere considerar la localidad espacial y temporal en memoria. Eigen almacena matrices en orden Column-Major por defecto, por lo que las operaciones que recorren columnas completas tienden a ser más favorables para caché que los accesos por filas. En la multiplicación X·w del dataset MNIST, el rendimiento real depende del orden de almacenamiento, del kernel generado por Eigen y de la vectorización disponible; por ello, la ventaja de localidad se interpreta como una optimización probable, no como una garantía absoluta.</w:t>
       </w:r>
     </w:p>
     <w:p>
@@ -1212,77 +1011,7 @@
         <w:rPr>
           <w:color w:val="000000"/>
         </w:rPr>
-        <w:t xml:space="preserve">La función </w:t>
-      </w:r>
-      <w:proofErr w:type="spellStart"/>
-      <w:r>
-        <w:rPr>
-          <w:color w:val="000000"/>
-        </w:rPr>
-        <w:t>sigmoid</w:t>
-      </w:r>
-      <w:proofErr w:type="spellEnd"/>
-      <w:r>
-        <w:rPr>
-          <w:color w:val="000000"/>
-        </w:rPr>
-        <w:t xml:space="preserve">() aplicada sobre un </w:t>
-      </w:r>
-      <w:proofErr w:type="spellStart"/>
-      <w:r>
-        <w:rPr>
-          <w:color w:val="000000"/>
-        </w:rPr>
-        <w:t>VectorXf</w:t>
-      </w:r>
-      <w:proofErr w:type="spellEnd"/>
-      <w:r>
-        <w:rPr>
-          <w:color w:val="000000"/>
-        </w:rPr>
-        <w:t xml:space="preserve"> explota expresiones plantilla (Eigen </w:t>
-      </w:r>
-      <w:proofErr w:type="spellStart"/>
-      <w:r>
-        <w:rPr>
-          <w:color w:val="000000"/>
-        </w:rPr>
-        <w:t>expression</w:t>
-      </w:r>
-      <w:proofErr w:type="spellEnd"/>
-      <w:r>
-        <w:rPr>
-          <w:color w:val="000000"/>
-        </w:rPr>
-        <w:t xml:space="preserve"> </w:t>
-      </w:r>
-      <w:proofErr w:type="spellStart"/>
-      <w:r>
-        <w:rPr>
-          <w:color w:val="000000"/>
-        </w:rPr>
-        <w:t>templates</w:t>
-      </w:r>
-      <w:proofErr w:type="spellEnd"/>
-      <w:r>
-        <w:rPr>
-          <w:color w:val="000000"/>
-        </w:rPr>
-        <w:t xml:space="preserve">) para ejecutar la evaluación </w:t>
-      </w:r>
-      <w:proofErr w:type="spellStart"/>
-      <w:r>
-        <w:rPr>
-          <w:color w:val="000000"/>
-        </w:rPr>
-        <w:t>lazy</w:t>
-      </w:r>
-      <w:proofErr w:type="spellEnd"/>
-      <w:r>
-        <w:rPr>
-          <w:color w:val="000000"/>
-        </w:rPr>
-        <w:t xml:space="preserve">: en lugar de crear vectores temporales </w:t>
+        <w:t xml:space="preserve">La función sigmoid() aplicada sobre un VectorXf explota expresiones plantilla (Eigen expression templates) para ejecutar la evaluación lazy: en lugar de crear vectores temporales </w:t>
       </w:r>
       <w:r>
         <w:rPr>
@@ -1340,119 +1069,7 @@
         <w:rPr>
           <w:color w:val="000000"/>
         </w:rPr>
-        <w:t xml:space="preserve">El </w:t>
-      </w:r>
-      <w:proofErr w:type="spellStart"/>
-      <w:r>
-        <w:rPr>
-          <w:color w:val="000000"/>
-        </w:rPr>
-        <w:t>dataset</w:t>
-      </w:r>
-      <w:proofErr w:type="spellEnd"/>
-      <w:r>
-        <w:rPr>
-          <w:color w:val="000000"/>
-        </w:rPr>
-        <w:t xml:space="preserve"> MNIST (</w:t>
-      </w:r>
-      <w:proofErr w:type="spellStart"/>
-      <w:r>
-        <w:rPr>
-          <w:color w:val="000000"/>
-        </w:rPr>
-        <w:t>Modified</w:t>
-      </w:r>
-      <w:proofErr w:type="spellEnd"/>
-      <w:r>
-        <w:rPr>
-          <w:color w:val="000000"/>
-        </w:rPr>
-        <w:t xml:space="preserve"> </w:t>
-      </w:r>
-      <w:proofErr w:type="spellStart"/>
-      <w:r>
-        <w:rPr>
-          <w:color w:val="000000"/>
-        </w:rPr>
-        <w:t>National</w:t>
-      </w:r>
-      <w:proofErr w:type="spellEnd"/>
-      <w:r>
-        <w:rPr>
-          <w:color w:val="000000"/>
-        </w:rPr>
-        <w:t xml:space="preserve"> </w:t>
-      </w:r>
-      <w:proofErr w:type="spellStart"/>
-      <w:r>
-        <w:rPr>
-          <w:color w:val="000000"/>
-        </w:rPr>
-        <w:t>Institute</w:t>
-      </w:r>
-      <w:proofErr w:type="spellEnd"/>
-      <w:r>
-        <w:rPr>
-          <w:color w:val="000000"/>
-        </w:rPr>
-        <w:t xml:space="preserve"> </w:t>
-      </w:r>
-      <w:proofErr w:type="spellStart"/>
-      <w:r>
-        <w:rPr>
-          <w:color w:val="000000"/>
-        </w:rPr>
-        <w:t>of</w:t>
-      </w:r>
-      <w:proofErr w:type="spellEnd"/>
-      <w:r>
-        <w:rPr>
-          <w:color w:val="000000"/>
-        </w:rPr>
-        <w:t xml:space="preserve"> </w:t>
-      </w:r>
-      <w:proofErr w:type="spellStart"/>
-      <w:r>
-        <w:rPr>
-          <w:color w:val="000000"/>
-        </w:rPr>
-        <w:t>Standards</w:t>
-      </w:r>
-      <w:proofErr w:type="spellEnd"/>
-      <w:r>
-        <w:rPr>
-          <w:color w:val="000000"/>
-        </w:rPr>
-        <w:t xml:space="preserve"> and </w:t>
-      </w:r>
-      <w:proofErr w:type="spellStart"/>
-      <w:r>
-        <w:rPr>
-          <w:color w:val="000000"/>
-        </w:rPr>
-        <w:t>Technology</w:t>
-      </w:r>
-      <w:proofErr w:type="spellEnd"/>
-      <w:r>
-        <w:rPr>
-          <w:color w:val="000000"/>
-        </w:rPr>
-        <w:t xml:space="preserve">) es el </w:t>
-      </w:r>
-      <w:proofErr w:type="spellStart"/>
-      <w:r>
-        <w:rPr>
-          <w:color w:val="000000"/>
-        </w:rPr>
-        <w:t>benchmark</w:t>
-      </w:r>
-      <w:proofErr w:type="spellEnd"/>
-      <w:r>
-        <w:rPr>
-          <w:color w:val="000000"/>
-        </w:rPr>
-        <w:t xml:space="preserve"> de referencia para algoritmos de reconocimiento de dígitos escritos a mano. Contiene 70.000 imágenes de 28×28 píxeles en escala de grises (valores 0–255), divididas en 60.000 para entrenamiento y 10.000 para prueba, con 10 clases balanceadas (dígitos 0–9).</w:t>
+        <w:t>El dataset MNIST (Modified National Institute of Standards and Technology) es el benchmark de referencia para algoritmos de reconocimiento de dígitos escritos a mano. Contiene 70.000 imágenes de 28×28 píxeles en escala de grises (valores 0–255), divididas en 60.000 para entrenamiento y 10.000 para prueba, con 10 clases balanceadas (dígitos 0–9).</w:t>
       </w:r>
     </w:p>
     <w:tbl>
@@ -2176,7 +1793,7 @@
         <w:pStyle w:val="ListParagraph"/>
         <w:numPr>
           <w:ilvl w:val="0"/>
-          <w:numId w:val="2"/>
+          <w:numId w:val="4"/>
         </w:numPr>
         <w:spacing w:after="80"/>
       </w:pPr>
@@ -2189,7 +1806,7 @@
         <w:pStyle w:val="ListParagraph"/>
         <w:numPr>
           <w:ilvl w:val="0"/>
-          <w:numId w:val="2"/>
+          <w:numId w:val="4"/>
         </w:numPr>
         <w:spacing w:after="80"/>
       </w:pPr>
@@ -2202,7 +1819,7 @@
         <w:pStyle w:val="ListParagraph"/>
         <w:numPr>
           <w:ilvl w:val="0"/>
-          <w:numId w:val="2"/>
+          <w:numId w:val="4"/>
         </w:numPr>
         <w:spacing w:after="80"/>
       </w:pPr>
@@ -2235,7 +1852,7 @@
         <w:pStyle w:val="ListParagraph"/>
         <w:numPr>
           <w:ilvl w:val="0"/>
-          <w:numId w:val="2"/>
+          <w:numId w:val="5"/>
         </w:numPr>
         <w:spacing w:after="80"/>
       </w:pPr>
@@ -2248,7 +1865,7 @@
         <w:pStyle w:val="ListParagraph"/>
         <w:numPr>
           <w:ilvl w:val="0"/>
-          <w:numId w:val="2"/>
+          <w:numId w:val="5"/>
         </w:numPr>
         <w:spacing w:after="80"/>
       </w:pPr>
@@ -2261,28 +1878,12 @@
         <w:pStyle w:val="ListParagraph"/>
         <w:numPr>
           <w:ilvl w:val="0"/>
-          <w:numId w:val="2"/>
+          <w:numId w:val="5"/>
         </w:numPr>
         <w:spacing w:after="80"/>
       </w:pPr>
       <w:r>
-        <w:t xml:space="preserve">El </w:t>
-      </w:r>
-      <w:proofErr w:type="spellStart"/>
-      <w:r>
-        <w:t>analisis</w:t>
-      </w:r>
-      <w:proofErr w:type="spellEnd"/>
-      <w:r>
-        <w:t xml:space="preserve"> PCA verificado muestra que 50 componentes explican aproximadamente el 60.98% de la varianza y que se requieren cerca de 180 componentes para alcanzar el 90%, evidenciando redundancia en los 784 pixeles originales sin exagerar la </w:t>
-      </w:r>
-      <w:proofErr w:type="spellStart"/>
-      <w:r>
-        <w:t>compresion</w:t>
-      </w:r>
-      <w:proofErr w:type="spellEnd"/>
-      <w:r>
-        <w:t>.</w:t>
+        <w:t>El análisis PCA verificado muestra que 50 componentes explican aproximadamente el 60.98% de la varianza y que se requieren cerca de 180 componentes para alcanzar el 90%, evidenciando redundancia en los 784 píxeles originales sin exagerar la compresión.</w:t>
       </w:r>
     </w:p>
     <w:p>
@@ -2290,20 +1891,12 @@
         <w:pStyle w:val="ListParagraph"/>
         <w:numPr>
           <w:ilvl w:val="0"/>
-          <w:numId w:val="2"/>
+          <w:numId w:val="5"/>
         </w:numPr>
         <w:spacing w:after="80"/>
       </w:pPr>
       <w:r>
-        <w:t xml:space="preserve">La proyección en los dos primeros componentes principales muestra </w:t>
-      </w:r>
-      <w:proofErr w:type="spellStart"/>
-      <w:r>
-        <w:t>clusters</w:t>
-      </w:r>
-      <w:proofErr w:type="spellEnd"/>
-      <w:r>
-        <w:t xml:space="preserve"> parcialmente separables, confirmando la viabilidad de un clasificador lineal.</w:t>
+        <w:t>La proyección en los dos primeros componentes principales muestra clusters parcialmente separables, confirmando la viabilidad de un clasificador lineal.</w:t>
       </w:r>
     </w:p>
     <w:p/>
@@ -2354,20 +1947,12 @@
         <w:pStyle w:val="ListParagraph"/>
         <w:numPr>
           <w:ilvl w:val="0"/>
-          <w:numId w:val="2"/>
+          <w:numId w:val="6"/>
         </w:numPr>
         <w:spacing w:after="80"/>
       </w:pPr>
       <w:r>
-        <w:t>División estratificada: 80% entrenamiento (~11.026 muestras) y 20% prueba (~2.794 muestras), manteniendo las proporciones de clase con semilla aleatoria fija (</w:t>
-      </w:r>
-      <w:proofErr w:type="spellStart"/>
-      <w:r>
-        <w:t>random_state</w:t>
-      </w:r>
-      <w:proofErr w:type="spellEnd"/>
-      <w:r>
-        <w:t>=42) para reproducibilidad.</w:t>
+        <w:t>División estratificada: 80% entrenamiento (~11.172 muestras) y 20% prueba (~2.794 muestras), manteniendo las proporciones de clase con semilla aleatoria fija (random_state=42) para reproducibilidad.</w:t>
       </w:r>
     </w:p>
     <w:p>
@@ -2375,28 +1960,12 @@
         <w:pStyle w:val="ListParagraph"/>
         <w:numPr>
           <w:ilvl w:val="0"/>
-          <w:numId w:val="2"/>
+          <w:numId w:val="6"/>
         </w:numPr>
         <w:spacing w:after="80"/>
       </w:pPr>
       <w:r>
-        <w:t xml:space="preserve">Normalización </w:t>
-      </w:r>
-      <w:proofErr w:type="spellStart"/>
-      <w:r>
-        <w:t>StandardScaler</w:t>
-      </w:r>
-      <w:proofErr w:type="spellEnd"/>
-      <w:r>
-        <w:t xml:space="preserve">: cada característica (píxel) se normaliza substrayendo su media y dividiéndola por su desviación estándar calculadas exclusivamente sobre el conjunto de entrenamiento. Esto evita data </w:t>
-      </w:r>
-      <w:proofErr w:type="spellStart"/>
-      <w:r>
-        <w:t>leakage</w:t>
-      </w:r>
-      <w:proofErr w:type="spellEnd"/>
-      <w:r>
-        <w:t xml:space="preserve"> y garantiza que el gradiente descendente opere en un espacio de características bien condicionado.</w:t>
+        <w:t>Normalización StandardScaler: cada característica (píxel) se normaliza restando su media y dividiéndola por su desviación estándar calculadas exclusivamente sobre el conjunto de entrenamiento. Esto evita data leakage y garantiza que el gradiente descendente opere en un espacio de características bien condicionado.</w:t>
       </w:r>
     </w:p>
     <w:p>
@@ -2404,7 +1973,7 @@
         <w:pStyle w:val="ListParagraph"/>
         <w:numPr>
           <w:ilvl w:val="0"/>
-          <w:numId w:val="2"/>
+          <w:numId w:val="6"/>
         </w:numPr>
         <w:spacing w:after="80"/>
       </w:pPr>
@@ -3503,33 +3072,12 @@
         <w:pStyle w:val="ListParagraph"/>
         <w:numPr>
           <w:ilvl w:val="0"/>
-          <w:numId w:val="2"/>
+          <w:numId w:val="7"/>
         </w:numPr>
         <w:spacing w:after="80"/>
       </w:pPr>
-      <w:proofErr w:type="spellStart"/>
-      <w:r>
-        <w:t>DataLoader</w:t>
-      </w:r>
-      <w:proofErr w:type="spellEnd"/>
-      <w:r>
-        <w:t xml:space="preserve">: Responsable de la lectura del CSV, filtrado de clases binarias, normalización </w:t>
-      </w:r>
-      <w:proofErr w:type="spellStart"/>
-      <w:r>
-        <w:t>StandardScaler</w:t>
-      </w:r>
-      <w:proofErr w:type="spellEnd"/>
-      <w:r>
-        <w:t xml:space="preserve"> y división de datos. Utiliza referencias constantes y referencias de salida para transferir matrices Eigen entre </w:t>
-      </w:r>
-      <w:proofErr w:type="spellStart"/>
-      <w:r>
-        <w:t>metodos</w:t>
-      </w:r>
-      <w:proofErr w:type="spellEnd"/>
-      <w:r>
-        <w:t>, evitando copias innecesarias en las operaciones principales.</w:t>
+      <w:r>
+        <w:t>DataLoader: Responsable de la lectura del CSV, filtrado de clases binarias, normalización StandardScaler y división de datos. Utiliza referencias constantes y referencias de salida para transferir matrices Eigen entre métodos, evitando copias innecesarias en las operaciones principales.</w:t>
       </w:r>
     </w:p>
     <w:p>
@@ -3537,7 +3085,7 @@
         <w:pStyle w:val="ListParagraph"/>
         <w:numPr>
           <w:ilvl w:val="0"/>
-          <w:numId w:val="2"/>
+          <w:numId w:val="7"/>
         </w:numPr>
         <w:spacing w:after="80"/>
       </w:pPr>
@@ -3603,7 +3151,7 @@
         <w:pStyle w:val="ListParagraph"/>
         <w:numPr>
           <w:ilvl w:val="0"/>
-          <w:numId w:val="2"/>
+          <w:numId w:val="7"/>
         </w:numPr>
         <w:spacing w:after="80"/>
       </w:pPr>
@@ -3645,57 +3193,12 @@
         <w:pStyle w:val="ListParagraph"/>
         <w:numPr>
           <w:ilvl w:val="0"/>
-          <w:numId w:val="2"/>
+          <w:numId w:val="7"/>
         </w:numPr>
         <w:spacing w:after="80"/>
       </w:pPr>
-      <w:proofErr w:type="spellStart"/>
-      <w:r>
-        <w:t>Benchmarker</w:t>
-      </w:r>
-      <w:proofErr w:type="spellEnd"/>
-      <w:r>
-        <w:t xml:space="preserve">: Mide el tiempo de </w:t>
-      </w:r>
-      <w:proofErr w:type="spellStart"/>
-      <w:r>
-        <w:t>ejecucion</w:t>
-      </w:r>
-      <w:proofErr w:type="spellEnd"/>
-      <w:r>
-        <w:t xml:space="preserve"> usando </w:t>
-      </w:r>
-      <w:proofErr w:type="spellStart"/>
-      <w:r>
-        <w:t>std</w:t>
-      </w:r>
-      <w:proofErr w:type="spellEnd"/>
-      <w:r>
-        <w:t>::</w:t>
-      </w:r>
-      <w:proofErr w:type="spellStart"/>
-      <w:r>
-        <w:t>chrono</w:t>
-      </w:r>
-      <w:proofErr w:type="spellEnd"/>
-      <w:r>
-        <w:t>::</w:t>
-      </w:r>
-      <w:proofErr w:type="spellStart"/>
-      <w:r>
-        <w:t>high_resolution_clock</w:t>
-      </w:r>
-      <w:proofErr w:type="spellEnd"/>
-      <w:r>
-        <w:t xml:space="preserve">; la </w:t>
-      </w:r>
-      <w:proofErr w:type="spellStart"/>
-      <w:r>
-        <w:t>resolucion</w:t>
-      </w:r>
-      <w:proofErr w:type="spellEnd"/>
-      <w:r>
-        <w:t xml:space="preserve"> efectiva depende del sistema operativo y del hardware.</w:t>
+      <w:r>
+        <w:t>Benchmarker: Mide el tiempo de ejecución usando std::chrono::high_resolution_clock; la resolución efectiva depende del sistema operativo y del hardware.</w:t>
       </w:r>
     </w:p>
     <w:p>
@@ -3715,35 +3218,7 @@
         <w:rPr>
           <w:color w:val="000000"/>
         </w:rPr>
-        <w:t xml:space="preserve">La implementación de la función sigmoide aprovecha las Eigen </w:t>
-      </w:r>
-      <w:proofErr w:type="spellStart"/>
-      <w:r>
-        <w:rPr>
-          <w:color w:val="000000"/>
-        </w:rPr>
-        <w:t>expression</w:t>
-      </w:r>
-      <w:proofErr w:type="spellEnd"/>
-      <w:r>
-        <w:rPr>
-          <w:color w:val="000000"/>
-        </w:rPr>
-        <w:t xml:space="preserve"> </w:t>
-      </w:r>
-      <w:proofErr w:type="spellStart"/>
-      <w:r>
-        <w:rPr>
-          <w:color w:val="000000"/>
-        </w:rPr>
-        <w:t>templates</w:t>
-      </w:r>
-      <w:proofErr w:type="spellEnd"/>
-      <w:r>
-        <w:rPr>
-          <w:color w:val="000000"/>
-        </w:rPr>
-        <w:t>:</w:t>
+        <w:t>La implementación de la función sigmoide aprovecha las Eigen expression templates:</w:t>
       </w:r>
     </w:p>
     <w:p>
@@ -3809,63 +3284,7 @@
         <w:rPr>
           <w:color w:val="000000"/>
         </w:rPr>
-        <w:t xml:space="preserve">Esta </w:t>
-      </w:r>
-      <w:proofErr w:type="spellStart"/>
-      <w:r>
-        <w:rPr>
-          <w:color w:val="000000"/>
-        </w:rPr>
-        <w:t>expresion</w:t>
-      </w:r>
-      <w:proofErr w:type="spellEnd"/>
-      <w:r>
-        <w:rPr>
-          <w:color w:val="000000"/>
-        </w:rPr>
-        <w:t xml:space="preserve"> aprovecha la </w:t>
-      </w:r>
-      <w:proofErr w:type="spellStart"/>
-      <w:r>
-        <w:rPr>
-          <w:color w:val="000000"/>
-        </w:rPr>
-        <w:t>evaluacion</w:t>
-      </w:r>
-      <w:proofErr w:type="spellEnd"/>
-      <w:r>
-        <w:rPr>
-          <w:color w:val="000000"/>
-        </w:rPr>
-        <w:t xml:space="preserve"> diferida de Eigen y reduce temporales intermedios; el grado exacto de </w:t>
-      </w:r>
-      <w:proofErr w:type="spellStart"/>
-      <w:r>
-        <w:rPr>
-          <w:color w:val="000000"/>
-        </w:rPr>
-        <w:t>vectorizacion</w:t>
-      </w:r>
-      <w:proofErr w:type="spellEnd"/>
-      <w:r>
-        <w:rPr>
-          <w:color w:val="000000"/>
-        </w:rPr>
-        <w:t xml:space="preserve"> depende del compilador y de la arquitectura usada. La conversión .array() activa la aritmética elemento a elemento, mientras que .</w:t>
-      </w:r>
-      <w:proofErr w:type="spellStart"/>
-      <w:r>
-        <w:rPr>
-          <w:color w:val="000000"/>
-        </w:rPr>
-        <w:t>matrix</w:t>
-      </w:r>
-      <w:proofErr w:type="spellEnd"/>
-      <w:r>
-        <w:rPr>
-          <w:color w:val="000000"/>
-        </w:rPr>
-        <w:t>() retorna al contexto de álgebra lineal.</w:t>
+        <w:t>Esta expresión aprovecha la evaluación diferida de Eigen y reduce temporales intermedios; el grado exacto de vectorización depende del compilador y de la arquitectura usada. La conversión .array() activa la aritmética elemento a elemento, mientras que .matrix() retorna al contexto de álgebra lineal.</w:t>
       </w:r>
     </w:p>
     <w:p>
@@ -3956,105 +3375,7 @@
         <w:rPr>
           <w:color w:val="000000"/>
         </w:rPr>
-        <w:t xml:space="preserve">Esta </w:t>
-      </w:r>
-      <w:proofErr w:type="spellStart"/>
-      <w:r>
-        <w:rPr>
-          <w:color w:val="000000"/>
-        </w:rPr>
-        <w:t>operacion</w:t>
-      </w:r>
-      <w:proofErr w:type="spellEnd"/>
-      <w:r>
-        <w:rPr>
-          <w:color w:val="000000"/>
-        </w:rPr>
-        <w:t xml:space="preserve"> aprovecha el motor de algebra lineal de Eigen y sus </w:t>
-      </w:r>
-      <w:proofErr w:type="spellStart"/>
-      <w:r>
-        <w:rPr>
-          <w:color w:val="000000"/>
-        </w:rPr>
-        <w:t>expression</w:t>
-      </w:r>
-      <w:proofErr w:type="spellEnd"/>
-      <w:r>
-        <w:rPr>
-          <w:color w:val="000000"/>
-        </w:rPr>
-        <w:t xml:space="preserve"> </w:t>
-      </w:r>
-      <w:proofErr w:type="spellStart"/>
-      <w:r>
-        <w:rPr>
-          <w:color w:val="000000"/>
-        </w:rPr>
-        <w:t>templates</w:t>
-      </w:r>
-      <w:proofErr w:type="spellEnd"/>
-      <w:r>
-        <w:rPr>
-          <w:color w:val="000000"/>
-        </w:rPr>
-        <w:t xml:space="preserve">; en esta entrega se compilo con </w:t>
-      </w:r>
-      <w:proofErr w:type="spellStart"/>
-      <w:r>
-        <w:rPr>
-          <w:color w:val="000000"/>
-        </w:rPr>
-        <w:t>CMake</w:t>
-      </w:r>
-      <w:proofErr w:type="spellEnd"/>
-      <w:r>
-        <w:rPr>
-          <w:color w:val="000000"/>
-        </w:rPr>
-        <w:t xml:space="preserve"> y </w:t>
-      </w:r>
-      <w:proofErr w:type="spellStart"/>
-      <w:r>
-        <w:rPr>
-          <w:color w:val="000000"/>
-        </w:rPr>
-        <w:t>optimizacion</w:t>
-      </w:r>
-      <w:proofErr w:type="spellEnd"/>
-      <w:r>
-        <w:rPr>
-          <w:color w:val="000000"/>
-        </w:rPr>
-        <w:t xml:space="preserve"> -O2, y el proyecto Qt conserva </w:t>
-      </w:r>
-      <w:proofErr w:type="spellStart"/>
-      <w:r>
-        <w:rPr>
-          <w:color w:val="000000"/>
-        </w:rPr>
-        <w:t>flags</w:t>
-      </w:r>
-      <w:proofErr w:type="spellEnd"/>
-      <w:r>
-        <w:rPr>
-          <w:color w:val="000000"/>
-        </w:rPr>
-        <w:t xml:space="preserve"> adicionales como -</w:t>
-      </w:r>
-      <w:proofErr w:type="spellStart"/>
-      <w:r>
-        <w:rPr>
-          <w:color w:val="000000"/>
-        </w:rPr>
-        <w:t>march</w:t>
-      </w:r>
-      <w:proofErr w:type="spellEnd"/>
-      <w:r>
-        <w:rPr>
-          <w:color w:val="000000"/>
-        </w:rPr>
-        <w:t>=native cuando el compilador los soporta.</w:t>
+        <w:t>Esta operación aprovecha el motor de álgebra lineal de Eigen y sus expression templates; en esta entrega se compilo con CMake y optimizacion -O2, y el proyecto Qt conserva flags adicionales como -march=native cuando el compilador los soporta.</w:t>
       </w:r>
     </w:p>
     <w:p>
@@ -4110,92 +3431,12 @@
         <w:pStyle w:val="ListParagraph"/>
         <w:numPr>
           <w:ilvl w:val="0"/>
-          <w:numId w:val="2"/>
+          <w:numId w:val="8"/>
         </w:numPr>
         <w:spacing w:after="80"/>
       </w:pPr>
       <w:r>
-        <w:t>Las matrices de datos (</w:t>
-      </w:r>
-      <w:proofErr w:type="spellStart"/>
-      <w:r>
-        <w:t>X_train</w:t>
-      </w:r>
-      <w:proofErr w:type="spellEnd"/>
-      <w:r>
-        <w:t xml:space="preserve">, </w:t>
-      </w:r>
-      <w:proofErr w:type="spellStart"/>
-      <w:r>
-        <w:t>X_test</w:t>
-      </w:r>
-      <w:proofErr w:type="spellEnd"/>
-      <w:r>
-        <w:t>) se manejan como objetos Eigen::</w:t>
-      </w:r>
-      <w:proofErr w:type="spellStart"/>
-      <w:r>
-        <w:t>MatrixXf</w:t>
-      </w:r>
-      <w:proofErr w:type="spellEnd"/>
-      <w:r>
-        <w:t xml:space="preserve"> con RAII; los objetos viven en el </w:t>
-      </w:r>
-      <w:proofErr w:type="spellStart"/>
-      <w:r>
-        <w:t>ambito</w:t>
-      </w:r>
-      <w:proofErr w:type="spellEnd"/>
-      <w:r>
-        <w:t xml:space="preserve"> de </w:t>
-      </w:r>
-      <w:proofErr w:type="spellStart"/>
-      <w:r>
-        <w:t>main</w:t>
-      </w:r>
-      <w:proofErr w:type="spellEnd"/>
-      <w:r>
-        <w:t xml:space="preserve">(), mientras que el almacenamiento </w:t>
-      </w:r>
-      <w:proofErr w:type="spellStart"/>
-      <w:r>
-        <w:t>numerico</w:t>
-      </w:r>
-      <w:proofErr w:type="spellEnd"/>
-      <w:r>
-        <w:t xml:space="preserve"> interno de Eigen se reserva </w:t>
-      </w:r>
-      <w:proofErr w:type="spellStart"/>
-      <w:r>
-        <w:t>dinamicamente</w:t>
-      </w:r>
-      <w:proofErr w:type="spellEnd"/>
-      <w:r>
-        <w:t xml:space="preserve"> </w:t>
-      </w:r>
-      <w:proofErr w:type="spellStart"/>
-      <w:r>
-        <w:t>segun</w:t>
-      </w:r>
-      <w:proofErr w:type="spellEnd"/>
-      <w:r>
-        <w:t xml:space="preserve"> el </w:t>
-      </w:r>
-      <w:proofErr w:type="spellStart"/>
-      <w:r>
-        <w:t>tamano</w:t>
-      </w:r>
-      <w:proofErr w:type="spellEnd"/>
-      <w:r>
-        <w:t xml:space="preserve"> del </w:t>
-      </w:r>
-      <w:proofErr w:type="spellStart"/>
-      <w:r>
-        <w:t>dataset</w:t>
-      </w:r>
-      <w:proofErr w:type="spellEnd"/>
-      <w:r>
-        <w:t>.</w:t>
+        <w:t>Las matrices de datos (X_train, X_test) se manejan como objetos Eigen::MatrixXf con RAII; los objetos viven en el ámbito de main(), mientras que el almacenamiento numérico interno de Eigen se reserva dinámicamente según el tamaño del dataset.</w:t>
       </w:r>
     </w:p>
     <w:p>
@@ -4203,68 +3444,12 @@
         <w:pStyle w:val="ListParagraph"/>
         <w:numPr>
           <w:ilvl w:val="0"/>
-          <w:numId w:val="2"/>
+          <w:numId w:val="8"/>
         </w:numPr>
         <w:spacing w:after="80"/>
       </w:pPr>
       <w:r>
-        <w:t>Los parámetros del modelo (</w:t>
-      </w:r>
-      <w:proofErr w:type="spellStart"/>
-      <w:r>
-        <w:t>weights</w:t>
-      </w:r>
-      <w:proofErr w:type="spellEnd"/>
-      <w:r>
-        <w:t xml:space="preserve">_, </w:t>
-      </w:r>
-      <w:proofErr w:type="spellStart"/>
-      <w:r>
-        <w:t>bias</w:t>
-      </w:r>
-      <w:proofErr w:type="spellEnd"/>
-      <w:r>
-        <w:t xml:space="preserve">_) son miembros de la clase </w:t>
-      </w:r>
-      <w:proofErr w:type="spellStart"/>
-      <w:r>
-        <w:t>LogisticRegressionEigen</w:t>
-      </w:r>
-      <w:proofErr w:type="spellEnd"/>
-      <w:r>
-        <w:t xml:space="preserve">, con ciclo de vida gestionado por el destructor implícito (RAII — </w:t>
-      </w:r>
-      <w:proofErr w:type="spellStart"/>
-      <w:r>
-        <w:t>Resource</w:t>
-      </w:r>
-      <w:proofErr w:type="spellEnd"/>
-      <w:r>
-        <w:t xml:space="preserve"> </w:t>
-      </w:r>
-      <w:proofErr w:type="spellStart"/>
-      <w:r>
-        <w:t>Acquisition</w:t>
-      </w:r>
-      <w:proofErr w:type="spellEnd"/>
-      <w:r>
-        <w:t xml:space="preserve"> </w:t>
-      </w:r>
-      <w:proofErr w:type="spellStart"/>
-      <w:r>
-        <w:t>Is</w:t>
-      </w:r>
-      <w:proofErr w:type="spellEnd"/>
-      <w:r>
-        <w:t xml:space="preserve"> </w:t>
-      </w:r>
-      <w:proofErr w:type="spellStart"/>
-      <w:r>
-        <w:t>Initialization</w:t>
-      </w:r>
-      <w:proofErr w:type="spellEnd"/>
-      <w:r>
-        <w:t>).</w:t>
+        <w:t>Los parámetros del modelo (weights_, bias_) son miembros de la clase LogisticRegressionEigen, con ciclo de vida gestionado por el destructor implícito (RAII — Resource Acquisition Is Initialization).</w:t>
       </w:r>
     </w:p>
     <w:p>
@@ -4272,28 +3457,12 @@
         <w:pStyle w:val="ListParagraph"/>
         <w:numPr>
           <w:ilvl w:val="0"/>
-          <w:numId w:val="2"/>
+          <w:numId w:val="8"/>
         </w:numPr>
         <w:spacing w:after="80"/>
       </w:pPr>
       <w:r>
-        <w:t xml:space="preserve">Localidad espacial: las operaciones matriciales se delegan a Eigen, que organiza los recorridos de memoria </w:t>
-      </w:r>
-      <w:proofErr w:type="spellStart"/>
-      <w:r>
-        <w:t>segun</w:t>
-      </w:r>
-      <w:proofErr w:type="spellEnd"/>
-      <w:r>
-        <w:t xml:space="preserve"> su almacenamiento </w:t>
-      </w:r>
-      <w:proofErr w:type="spellStart"/>
-      <w:r>
-        <w:t>column-major</w:t>
-      </w:r>
-      <w:proofErr w:type="spellEnd"/>
-      <w:r>
-        <w:t xml:space="preserve"> y las expresiones usadas; esto mejora el acceso secuencial frente a bucles manuales no optimizados.</w:t>
+        <w:t>Localidad espacial: las operaciones matriciales se delegan a Eigen, que organiza los recorridos de memoria según su almacenamiento column-major y las expresiones usadas; esto puede mejorar el acceso secuencial frente a bucles manuales no optimizados, siempre que el patrón de acceso coincida con el layout de datos.</w:t>
       </w:r>
     </w:p>
     <w:p>
@@ -4301,7 +3470,7 @@
         <w:pStyle w:val="ListParagraph"/>
         <w:numPr>
           <w:ilvl w:val="0"/>
-          <w:numId w:val="2"/>
+          <w:numId w:val="8"/>
         </w:numPr>
         <w:spacing w:after="80"/>
       </w:pPr>
@@ -4367,161 +3536,7 @@
         <w:rPr>
           <w:color w:val="000000"/>
         </w:rPr>
-        <w:t xml:space="preserve">El proyecto puede compilarse con Qt </w:t>
-      </w:r>
-      <w:proofErr w:type="spellStart"/>
-      <w:r>
-        <w:rPr>
-          <w:color w:val="000000"/>
-        </w:rPr>
-        <w:t>Creator</w:t>
-      </w:r>
-      <w:proofErr w:type="spellEnd"/>
-      <w:r>
-        <w:rPr>
-          <w:color w:val="000000"/>
-        </w:rPr>
-        <w:t xml:space="preserve"> usando el archivo .pro o por </w:t>
-      </w:r>
-      <w:proofErr w:type="spellStart"/>
-      <w:r>
-        <w:rPr>
-          <w:color w:val="000000"/>
-        </w:rPr>
-        <w:t>linea</w:t>
-      </w:r>
-      <w:proofErr w:type="spellEnd"/>
-      <w:r>
-        <w:rPr>
-          <w:color w:val="000000"/>
-        </w:rPr>
-        <w:t xml:space="preserve"> de comandos con </w:t>
-      </w:r>
-      <w:proofErr w:type="spellStart"/>
-      <w:r>
-        <w:rPr>
-          <w:color w:val="000000"/>
-        </w:rPr>
-        <w:t>CMake</w:t>
-      </w:r>
-      <w:proofErr w:type="spellEnd"/>
-      <w:r>
-        <w:rPr>
-          <w:color w:val="000000"/>
-        </w:rPr>
-        <w:t xml:space="preserve">. La </w:t>
-      </w:r>
-      <w:proofErr w:type="spellStart"/>
-      <w:r>
-        <w:rPr>
-          <w:color w:val="000000"/>
-        </w:rPr>
-        <w:t>validacion</w:t>
-      </w:r>
-      <w:proofErr w:type="spellEnd"/>
-      <w:r>
-        <w:rPr>
-          <w:color w:val="000000"/>
-        </w:rPr>
-        <w:t xml:space="preserve"> final se </w:t>
-      </w:r>
-      <w:proofErr w:type="spellStart"/>
-      <w:r>
-        <w:rPr>
-          <w:color w:val="000000"/>
-        </w:rPr>
-        <w:t>realizo</w:t>
-      </w:r>
-      <w:proofErr w:type="spellEnd"/>
-      <w:r>
-        <w:rPr>
-          <w:color w:val="000000"/>
-        </w:rPr>
-        <w:t xml:space="preserve"> con </w:t>
-      </w:r>
-      <w:proofErr w:type="spellStart"/>
-      <w:r>
-        <w:rPr>
-          <w:color w:val="000000"/>
-        </w:rPr>
-        <w:t>CMake</w:t>
-      </w:r>
-      <w:proofErr w:type="spellEnd"/>
-      <w:r>
-        <w:rPr>
-          <w:color w:val="000000"/>
-        </w:rPr>
-        <w:t xml:space="preserve">, </w:t>
-      </w:r>
-      <w:proofErr w:type="spellStart"/>
-      <w:r>
-        <w:rPr>
-          <w:color w:val="000000"/>
-        </w:rPr>
-        <w:t>MinGW</w:t>
-      </w:r>
-      <w:proofErr w:type="spellEnd"/>
-      <w:r>
-        <w:rPr>
-          <w:color w:val="000000"/>
-        </w:rPr>
-        <w:t>/</w:t>
-      </w:r>
-      <w:proofErr w:type="spellStart"/>
-      <w:r>
-        <w:rPr>
-          <w:color w:val="000000"/>
-        </w:rPr>
-        <w:t>WinLibs</w:t>
-      </w:r>
-      <w:proofErr w:type="spellEnd"/>
-      <w:r>
-        <w:rPr>
-          <w:color w:val="000000"/>
-        </w:rPr>
-        <w:t xml:space="preserve"> y Eigen local en </w:t>
-      </w:r>
-      <w:proofErr w:type="spellStart"/>
-      <w:r>
-        <w:rPr>
-          <w:color w:val="000000"/>
-        </w:rPr>
-        <w:t>third_party</w:t>
-      </w:r>
-      <w:proofErr w:type="spellEnd"/>
-      <w:r>
-        <w:rPr>
-          <w:color w:val="000000"/>
-        </w:rPr>
-        <w:t>/</w:t>
-      </w:r>
-      <w:proofErr w:type="spellStart"/>
-      <w:r>
-        <w:rPr>
-          <w:color w:val="000000"/>
-        </w:rPr>
-        <w:t>eigen</w:t>
-      </w:r>
-      <w:proofErr w:type="spellEnd"/>
-      <w:r>
-        <w:rPr>
-          <w:color w:val="000000"/>
-        </w:rPr>
-        <w:t xml:space="preserve">. La </w:t>
-      </w:r>
-      <w:proofErr w:type="spellStart"/>
-      <w:r>
-        <w:rPr>
-          <w:color w:val="000000"/>
-        </w:rPr>
-        <w:t>configuracion</w:t>
-      </w:r>
-      <w:proofErr w:type="spellEnd"/>
-      <w:r>
-        <w:rPr>
-          <w:color w:val="000000"/>
-        </w:rPr>
-        <w:t xml:space="preserve"> incluye:</w:t>
+        <w:t>El proyecto mantiene compatibilidad directa con Qt Creator mediante el archivo logistic_regression.pro y también puede compilarse por línea de comandos con CMake. La validación final se realizó con CMake, MinGW/WinLibs y Eigen local en third_party/eigen, sin eliminar el flujo de trabajo en Qt Creator. La configuración incluye:</w:t>
       </w:r>
     </w:p>
     <w:p>
@@ -4529,7 +3544,7 @@
         <w:pStyle w:val="ListParagraph"/>
         <w:numPr>
           <w:ilvl w:val="0"/>
-          <w:numId w:val="2"/>
+          <w:numId w:val="9"/>
         </w:numPr>
         <w:spacing w:after="80"/>
       </w:pPr>
@@ -4563,7 +3578,7 @@
         <w:pStyle w:val="ListParagraph"/>
         <w:numPr>
           <w:ilvl w:val="0"/>
-          <w:numId w:val="2"/>
+          <w:numId w:val="9"/>
         </w:numPr>
         <w:spacing w:after="80"/>
       </w:pPr>
@@ -4584,28 +3599,12 @@
         <w:pStyle w:val="ListParagraph"/>
         <w:numPr>
           <w:ilvl w:val="0"/>
-          <w:numId w:val="2"/>
+          <w:numId w:val="9"/>
         </w:numPr>
         <w:spacing w:after="80"/>
       </w:pPr>
       <w:r>
-        <w:t xml:space="preserve">Estándar C++17: usado como </w:t>
-      </w:r>
-      <w:proofErr w:type="spellStart"/>
-      <w:r>
-        <w:t>configuracion</w:t>
-      </w:r>
-      <w:proofErr w:type="spellEnd"/>
-      <w:r>
-        <w:t xml:space="preserve"> de </w:t>
-      </w:r>
-      <w:proofErr w:type="spellStart"/>
-      <w:r>
-        <w:t>compilacion</w:t>
-      </w:r>
-      <w:proofErr w:type="spellEnd"/>
-      <w:r>
-        <w:t xml:space="preserve"> moderna y compatible con Eigen.</w:t>
+        <w:t>Estándar C++17: usado como configuración de compilación moderna y compatible con Eigen.</w:t>
       </w:r>
     </w:p>
     <w:p/>
@@ -5483,29 +4482,7 @@
           <w:sz w:val="18"/>
           <w:szCs w:val="18"/>
         </w:rPr>
-        <w:t xml:space="preserve">Tabla 4. Comparativa de rendimiento Python vs C++ verificada con </w:t>
-      </w:r>
-      <w:proofErr w:type="spellStart"/>
-      <w:r>
-        <w:rPr>
-          <w:i/>
-          <w:iCs/>
-          <w:color w:val="555555"/>
-          <w:sz w:val="18"/>
-          <w:szCs w:val="18"/>
-        </w:rPr>
-        <w:t>results</w:t>
-      </w:r>
-      <w:proofErr w:type="spellEnd"/>
-      <w:r>
-        <w:rPr>
-          <w:i/>
-          <w:iCs/>
-          <w:color w:val="555555"/>
-          <w:sz w:val="18"/>
-          <w:szCs w:val="18"/>
-        </w:rPr>
-        <w:t>/results/resultados_cpp.txt</w:t>
+        <w:t>Tabla 4. Comparativa de rendimiento Python vs C++ verificada con results/resultados_cpp.txt</w:t>
       </w:r>
     </w:p>
     <w:p/>
@@ -5534,91 +4511,7 @@
         <w:rPr>
           <w:color w:val="000000"/>
         </w:rPr>
-        <w:t xml:space="preserve">Ambas implementaciones logran </w:t>
-      </w:r>
-      <w:proofErr w:type="spellStart"/>
-      <w:r>
-        <w:rPr>
-          <w:color w:val="000000"/>
-        </w:rPr>
-        <w:t>metricas</w:t>
-      </w:r>
-      <w:proofErr w:type="spellEnd"/>
-      <w:r>
-        <w:rPr>
-          <w:color w:val="000000"/>
-        </w:rPr>
-        <w:t xml:space="preserve"> del mismo orden (~96%), lo que valida la correctitud </w:t>
-      </w:r>
-      <w:proofErr w:type="spellStart"/>
-      <w:r>
-        <w:rPr>
-          <w:color w:val="000000"/>
-        </w:rPr>
-        <w:t>matematica</w:t>
-      </w:r>
-      <w:proofErr w:type="spellEnd"/>
-      <w:r>
-        <w:rPr>
-          <w:color w:val="000000"/>
-        </w:rPr>
-        <w:t xml:space="preserve"> de la </w:t>
-      </w:r>
-      <w:proofErr w:type="spellStart"/>
-      <w:r>
-        <w:rPr>
-          <w:color w:val="000000"/>
-        </w:rPr>
-        <w:t>implementacion</w:t>
-      </w:r>
-      <w:proofErr w:type="spellEnd"/>
-      <w:r>
-        <w:rPr>
-          <w:color w:val="000000"/>
-        </w:rPr>
-        <w:t xml:space="preserve"> C++ frente al </w:t>
-      </w:r>
-      <w:proofErr w:type="spellStart"/>
-      <w:r>
-        <w:rPr>
-          <w:color w:val="000000"/>
-        </w:rPr>
-        <w:t>baseline</w:t>
-      </w:r>
-      <w:proofErr w:type="spellEnd"/>
-      <w:r>
-        <w:rPr>
-          <w:color w:val="000000"/>
-        </w:rPr>
-        <w:t xml:space="preserve"> Python. Las diferencias pequeñas entre Python y C++ se deben al optimizador usado, al </w:t>
-      </w:r>
-      <w:proofErr w:type="spellStart"/>
-      <w:r>
-        <w:rPr>
-          <w:color w:val="000000"/>
-        </w:rPr>
-        <w:t>split</w:t>
-      </w:r>
-      <w:proofErr w:type="spellEnd"/>
-      <w:r>
-        <w:rPr>
-          <w:color w:val="000000"/>
-        </w:rPr>
-        <w:t xml:space="preserve"> estratificado propio de cada </w:t>
-      </w:r>
-      <w:proofErr w:type="spellStart"/>
-      <w:r>
-        <w:rPr>
-          <w:color w:val="000000"/>
-        </w:rPr>
-        <w:t>implementacion</w:t>
-      </w:r>
-      <w:proofErr w:type="spellEnd"/>
-      <w:r>
-        <w:rPr>
-          <w:color w:val="000000"/>
-        </w:rPr>
-        <w:t xml:space="preserve"> y al camino de convergencia, no a una diferencia fundamental en el algoritmo.</w:t>
+        <w:t>Ambas implementaciones logran métricas del mismo orden (~96%), lo que valida la correctitud matemática de la implementación C++ frente al baseline Python. Las diferencias pequeñas entre Python y C++ se deben al optimizador usado, al split estratificado propio de cada implementación y al camino de convergencia, no a una diferencia fundamental en el algoritmo.</w:t>
       </w:r>
     </w:p>
     <w:p>
@@ -5664,35 +4557,7 @@
         <w:rPr>
           <w:color w:val="000000"/>
         </w:rPr>
-        <w:t xml:space="preserve">Python con L-BFGS converge en significativamente menos iteraciones que el </w:t>
-      </w:r>
-      <w:proofErr w:type="spellStart"/>
-      <w:r>
-        <w:rPr>
-          <w:color w:val="000000"/>
-        </w:rPr>
-        <w:t>Gradient</w:t>
-      </w:r>
-      <w:proofErr w:type="spellEnd"/>
-      <w:r>
-        <w:rPr>
-          <w:color w:val="000000"/>
-        </w:rPr>
-        <w:t xml:space="preserve"> </w:t>
-      </w:r>
-      <w:proofErr w:type="spellStart"/>
-      <w:r>
-        <w:rPr>
-          <w:color w:val="000000"/>
-        </w:rPr>
-        <w:t>Descent</w:t>
-      </w:r>
-      <w:proofErr w:type="spellEnd"/>
-      <w:r>
-        <w:rPr>
-          <w:color w:val="000000"/>
-        </w:rPr>
-        <w:t xml:space="preserve"> de C++, puesto que L-BFGS usa información de segundo orden (curvatura) para actualizar los parámetros de forma más inteligente. Sin embargo, cada iteración de L-BFGS es más costosa computacionalmente.</w:t>
+        <w:t>Python con L-BFGS converge en significativamente menos iteraciones que el GradientDescent de C++, puesto que L-BFGS usa información de segundo orden (curvatura) para actualizar los parámetros de forma más inteligente. Sin embargo, cada iteración de L-BFGS es más costosa computacionalmente.</w:t>
       </w:r>
     </w:p>
     <w:p>
@@ -5704,119 +4569,7 @@
         <w:rPr>
           <w:color w:val="000000"/>
         </w:rPr>
-        <w:t xml:space="preserve">El </w:t>
-      </w:r>
-      <w:proofErr w:type="spellStart"/>
-      <w:r>
-        <w:rPr>
-          <w:color w:val="000000"/>
-        </w:rPr>
-        <w:t>Gradient</w:t>
-      </w:r>
-      <w:proofErr w:type="spellEnd"/>
-      <w:r>
-        <w:rPr>
-          <w:color w:val="000000"/>
-        </w:rPr>
-        <w:t xml:space="preserve"> </w:t>
-      </w:r>
-      <w:proofErr w:type="spellStart"/>
-      <w:r>
-        <w:rPr>
-          <w:color w:val="000000"/>
-        </w:rPr>
-        <w:t>Descent</w:t>
-      </w:r>
-      <w:proofErr w:type="spellEnd"/>
-      <w:r>
-        <w:rPr>
-          <w:color w:val="000000"/>
-        </w:rPr>
-        <w:t xml:space="preserve"> implementado en C++ usa 500 </w:t>
-      </w:r>
-      <w:proofErr w:type="spellStart"/>
-      <w:r>
-        <w:rPr>
-          <w:color w:val="000000"/>
-        </w:rPr>
-        <w:t>epocas</w:t>
-      </w:r>
-      <w:proofErr w:type="spellEnd"/>
-      <w:r>
-        <w:rPr>
-          <w:color w:val="000000"/>
-        </w:rPr>
-        <w:t xml:space="preserve">, mientras que L-BFGS en Python </w:t>
-      </w:r>
-      <w:proofErr w:type="spellStart"/>
-      <w:r>
-        <w:rPr>
-          <w:color w:val="000000"/>
-        </w:rPr>
-        <w:t>convergio</w:t>
-      </w:r>
-      <w:proofErr w:type="spellEnd"/>
-      <w:r>
-        <w:rPr>
-          <w:color w:val="000000"/>
-        </w:rPr>
-        <w:t xml:space="preserve"> en 90 iteraciones en la </w:t>
-      </w:r>
-      <w:proofErr w:type="spellStart"/>
-      <w:r>
-        <w:rPr>
-          <w:color w:val="000000"/>
-        </w:rPr>
-        <w:t>ejecucion</w:t>
-      </w:r>
-      <w:proofErr w:type="spellEnd"/>
-      <w:r>
-        <w:rPr>
-          <w:color w:val="000000"/>
-        </w:rPr>
-        <w:t xml:space="preserve"> verificada. Cada </w:t>
-      </w:r>
-      <w:proofErr w:type="spellStart"/>
-      <w:r>
-        <w:rPr>
-          <w:color w:val="000000"/>
-        </w:rPr>
-        <w:t>epoca</w:t>
-      </w:r>
-      <w:proofErr w:type="spellEnd"/>
-      <w:r>
-        <w:rPr>
-          <w:color w:val="000000"/>
-        </w:rPr>
-        <w:t xml:space="preserve"> C++ es eficiente gracias a las operaciones vectorizadas de Eigen. En un escenario con recursos limitados, una </w:t>
-      </w:r>
-      <w:proofErr w:type="spellStart"/>
-      <w:r>
-        <w:rPr>
-          <w:color w:val="000000"/>
-        </w:rPr>
-        <w:t>implementacion</w:t>
-      </w:r>
-      <w:proofErr w:type="spellEnd"/>
-      <w:r>
-        <w:rPr>
-          <w:color w:val="000000"/>
-        </w:rPr>
-        <w:t xml:space="preserve"> C++ permite mayor control sobre dependencias, memoria y despliegue que el </w:t>
-      </w:r>
-      <w:proofErr w:type="spellStart"/>
-      <w:r>
-        <w:rPr>
-          <w:color w:val="000000"/>
-        </w:rPr>
-        <w:t>stack</w:t>
-      </w:r>
-      <w:proofErr w:type="spellEnd"/>
-      <w:r>
-        <w:rPr>
-          <w:color w:val="000000"/>
-        </w:rPr>
-        <w:t xml:space="preserve"> completo de Python.</w:t>
+        <w:t>El GradientDescent implementado en C++ usa 500 épocas, mientras que L-BFGS en Python convergió en 90 iteraciones en la ejecución verificada. Cada época C++ es eficiente gracias a las operaciones vectorizadas de Eigen. En un escenario con recursos limitados, una implementación C++ permite mayor control sobre dependencias, memoria y despliegue que el stack completo de Python.</w:t>
       </w:r>
     </w:p>
     <w:p>
@@ -5836,63 +4589,7 @@
         <w:rPr>
           <w:color w:val="000000"/>
         </w:rPr>
-        <w:t xml:space="preserve">La diferencia de memoria es la más pronunciada entre ambas implementaciones. Python consume ~395.54 MB debido al </w:t>
-      </w:r>
-      <w:proofErr w:type="spellStart"/>
-      <w:r>
-        <w:rPr>
-          <w:color w:val="000000"/>
-        </w:rPr>
-        <w:t>overhead</w:t>
-      </w:r>
-      <w:proofErr w:type="spellEnd"/>
-      <w:r>
-        <w:rPr>
-          <w:color w:val="000000"/>
-        </w:rPr>
-        <w:t xml:space="preserve"> del intérprete, </w:t>
-      </w:r>
-      <w:proofErr w:type="spellStart"/>
-      <w:r>
-        <w:rPr>
-          <w:color w:val="000000"/>
-        </w:rPr>
-        <w:t>NumPy</w:t>
-      </w:r>
-      <w:proofErr w:type="spellEnd"/>
-      <w:r>
-        <w:rPr>
-          <w:color w:val="000000"/>
-        </w:rPr>
-        <w:t xml:space="preserve">, </w:t>
-      </w:r>
-      <w:proofErr w:type="spellStart"/>
-      <w:r>
-        <w:rPr>
-          <w:color w:val="000000"/>
-        </w:rPr>
-        <w:t>Scikit</w:t>
-      </w:r>
-      <w:proofErr w:type="spellEnd"/>
-      <w:r>
-        <w:rPr>
-          <w:color w:val="000000"/>
-        </w:rPr>
-        <w:t xml:space="preserve">-Learn y todas sus dependencias cargadas en memoria. En contraste, C++ con Eigen carga las matrices de datos y los </w:t>
-      </w:r>
-      <w:proofErr w:type="spellStart"/>
-      <w:r>
-        <w:rPr>
-          <w:color w:val="000000"/>
-        </w:rPr>
-        <w:t>parametros</w:t>
-      </w:r>
-      <w:proofErr w:type="spellEnd"/>
-      <w:r>
-        <w:rPr>
-          <w:color w:val="000000"/>
-        </w:rPr>
-        <w:t xml:space="preserve"> del modelo, resultando en ~88.36 MB de pico de memoria medido con WorkingSet64 en Windows.</w:t>
+        <w:t>La diferencia de memoria es la más pronunciada entre ambas implementaciones. Python consume ~395.54 MB debido al overhead del intérprete, NumPy, Scikit-Learn y todas sus dependencias cargadas en memoria. En contraste, C++ con Eigen carga las matrices de datos y los parámetros del modelo, resultando en ~88.36 MB de pico de memoria medido con WorkingSet64 en Windows.</w:t>
       </w:r>
     </w:p>
     <w:p>
@@ -5905,105 +4602,7 @@
           <w:color w:val="000000"/>
         </w:rPr>
         <w:lastRenderedPageBreak/>
-        <w:t xml:space="preserve">Esta diferencia aproximada de 4.48x en consumo de memoria muestra una ventaja clara de C++ para entornos con recursos </w:t>
-      </w:r>
-      <w:proofErr w:type="spellStart"/>
-      <w:r>
-        <w:rPr>
-          <w:color w:val="000000"/>
-        </w:rPr>
-        <w:t>mas</w:t>
-      </w:r>
-      <w:proofErr w:type="spellEnd"/>
-      <w:r>
-        <w:rPr>
-          <w:color w:val="000000"/>
-        </w:rPr>
-        <w:t xml:space="preserve"> limitados. Para dispositivos embebidos muy </w:t>
-      </w:r>
-      <w:proofErr w:type="spellStart"/>
-      <w:r>
-        <w:rPr>
-          <w:color w:val="000000"/>
-        </w:rPr>
-        <w:t>pequenos</w:t>
-      </w:r>
-      <w:proofErr w:type="spellEnd"/>
-      <w:r>
-        <w:rPr>
-          <w:color w:val="000000"/>
-        </w:rPr>
-        <w:t xml:space="preserve"> </w:t>
-      </w:r>
-      <w:proofErr w:type="spellStart"/>
-      <w:r>
-        <w:rPr>
-          <w:color w:val="000000"/>
-        </w:rPr>
-        <w:t>seria</w:t>
-      </w:r>
-      <w:proofErr w:type="spellEnd"/>
-      <w:r>
-        <w:rPr>
-          <w:color w:val="000000"/>
-        </w:rPr>
-        <w:t xml:space="preserve"> necesario reducir el </w:t>
-      </w:r>
-      <w:proofErr w:type="spellStart"/>
-      <w:r>
-        <w:rPr>
-          <w:color w:val="000000"/>
-        </w:rPr>
-        <w:t>dataset</w:t>
-      </w:r>
-      <w:proofErr w:type="spellEnd"/>
-      <w:r>
-        <w:rPr>
-          <w:color w:val="000000"/>
-        </w:rPr>
-        <w:t xml:space="preserve">, usar inferencia con pesos ya entrenados o aplicar </w:t>
-      </w:r>
-      <w:proofErr w:type="spellStart"/>
-      <w:r>
-        <w:rPr>
-          <w:color w:val="000000"/>
-        </w:rPr>
-        <w:t>tecnicas</w:t>
-      </w:r>
-      <w:proofErr w:type="spellEnd"/>
-      <w:r>
-        <w:rPr>
-          <w:color w:val="000000"/>
-        </w:rPr>
-        <w:t xml:space="preserve"> adicionales de </w:t>
-      </w:r>
-      <w:proofErr w:type="spellStart"/>
-      <w:r>
-        <w:rPr>
-          <w:color w:val="000000"/>
-        </w:rPr>
-        <w:t>compresion</w:t>
-      </w:r>
-      <w:proofErr w:type="spellEnd"/>
-      <w:r>
-        <w:rPr>
-          <w:color w:val="000000"/>
-        </w:rPr>
-        <w:t>/</w:t>
-      </w:r>
-      <w:proofErr w:type="spellStart"/>
-      <w:r>
-        <w:rPr>
-          <w:color w:val="000000"/>
-        </w:rPr>
-        <w:t>streaming</w:t>
-      </w:r>
-      <w:proofErr w:type="spellEnd"/>
-      <w:r>
-        <w:rPr>
-          <w:color w:val="000000"/>
-        </w:rPr>
-        <w:t>.</w:t>
+        <w:t>Esta diferencia aproximada de 4.48x en consumo de memoria muestra una ventaja clara de C++ para entornos con recursos más limitados. Para dispositivos embebidos muy pequeñosseria necesario reducir el dataset, usar inferencia con pesos ya entrenados o aplicar técnicas adicionales de compresión/streaming.</w:t>
       </w:r>
     </w:p>
     <w:p>
@@ -6031,57 +4630,12 @@
         <w:pStyle w:val="ListParagraph"/>
         <w:numPr>
           <w:ilvl w:val="0"/>
-          <w:numId w:val="2"/>
+          <w:numId w:val="10"/>
         </w:numPr>
         <w:spacing w:after="80"/>
       </w:pPr>
-      <w:proofErr w:type="spellStart"/>
-      <w:r>
-        <w:t>Multiplicacion</w:t>
-      </w:r>
-      <w:proofErr w:type="spellEnd"/>
-      <w:r>
-        <w:t xml:space="preserve"> X*w: cada muestra contiene 784 </w:t>
-      </w:r>
-      <w:proofErr w:type="spellStart"/>
-      <w:r>
-        <w:t>floats</w:t>
-      </w:r>
-      <w:proofErr w:type="spellEnd"/>
-      <w:r>
-        <w:t xml:space="preserve"> (~3.136 bytes). Eigen ejecuta la </w:t>
-      </w:r>
-      <w:proofErr w:type="spellStart"/>
-      <w:r>
-        <w:t>operacion</w:t>
-      </w:r>
-      <w:proofErr w:type="spellEnd"/>
-      <w:r>
-        <w:t xml:space="preserve"> vectorizada y gestiona el recorrido de memoria; el </w:t>
-      </w:r>
-      <w:proofErr w:type="spellStart"/>
-      <w:r>
-        <w:t>tamano</w:t>
-      </w:r>
-      <w:proofErr w:type="spellEnd"/>
-      <w:r>
-        <w:t xml:space="preserve"> de una muestra cabe en cache L1 </w:t>
-      </w:r>
-      <w:proofErr w:type="spellStart"/>
-      <w:r>
-        <w:t>tipica</w:t>
-      </w:r>
-      <w:proofErr w:type="spellEnd"/>
-      <w:r>
-        <w:t xml:space="preserve">, aunque la localidad exacta depende del orden de almacenamiento y del </w:t>
-      </w:r>
-      <w:proofErr w:type="spellStart"/>
-      <w:r>
-        <w:t>kernel</w:t>
-      </w:r>
-      <w:proofErr w:type="spellEnd"/>
-      <w:r>
-        <w:t xml:space="preserve"> generado.</w:t>
+      <w:r>
+        <w:t>Multiplicación X*w: cada muestra contiene 784 floats (~3.136 bytes). Eigen ejecuta la operación vectorizada y gestiona el recorrido de memoria; el tamaño de una muestra cabe en caché L1 típica, aunque la localidad exacta depende del orden de almacenamiento y del kernel generado.</w:t>
       </w:r>
     </w:p>
     <w:p>
@@ -6089,44 +4643,12 @@
         <w:pStyle w:val="ListParagraph"/>
         <w:numPr>
           <w:ilvl w:val="0"/>
-          <w:numId w:val="2"/>
+          <w:numId w:val="10"/>
         </w:numPr>
         <w:spacing w:after="80"/>
       </w:pPr>
       <w:r>
-        <w:t xml:space="preserve">Función sigmoide: aplica </w:t>
-      </w:r>
-      <w:proofErr w:type="spellStart"/>
-      <w:r>
-        <w:t>exp</w:t>
-      </w:r>
-      <w:proofErr w:type="spellEnd"/>
-      <w:r>
-        <w:t xml:space="preserve">() elemento a elemento sobre el vector z (n </w:t>
-      </w:r>
-      <w:proofErr w:type="spellStart"/>
-      <w:r>
-        <w:t>floats</w:t>
-      </w:r>
-      <w:proofErr w:type="spellEnd"/>
-      <w:r>
-        <w:t xml:space="preserve">), con patrón de acceso perfectamente secuencial. Las </w:t>
-      </w:r>
-      <w:proofErr w:type="spellStart"/>
-      <w:r>
-        <w:t>expression</w:t>
-      </w:r>
-      <w:proofErr w:type="spellEnd"/>
-      <w:r>
-        <w:t xml:space="preserve"> </w:t>
-      </w:r>
-      <w:proofErr w:type="spellStart"/>
-      <w:r>
-        <w:t>templates</w:t>
-      </w:r>
-      <w:proofErr w:type="spellEnd"/>
-      <w:r>
-        <w:t xml:space="preserve"> de Eigen fusionan esta operación con la resta y la división en un único bucle.</w:t>
+        <w:t>Función sigmoide: aplica exp() elemento a elemento sobre el vector z (n floats), con patrón de acceso perfectamente secuencial. Las expression templates de Eigen fusionan esta operación con la resta y la división en un único bucle.</w:t>
       </w:r>
     </w:p>
     <w:p>
@@ -6134,7 +4656,7 @@
         <w:pStyle w:val="ListParagraph"/>
         <w:numPr>
           <w:ilvl w:val="0"/>
-          <w:numId w:val="2"/>
+          <w:numId w:val="10"/>
         </w:numPr>
         <w:spacing w:after="80"/>
       </w:pPr>
@@ -6174,49 +4696,7 @@
         <w:rPr>
           <w:color w:val="000000"/>
         </w:rPr>
-        <w:t xml:space="preserve">El proyecto demuestra con evidencia empírica que la Regresión Logística es un clasificador robusto para el problema de clasificación binaria de dígitos MNIST, alcanzando </w:t>
-      </w:r>
-      <w:proofErr w:type="spellStart"/>
-      <w:r>
-        <w:rPr>
-          <w:color w:val="000000"/>
-        </w:rPr>
-        <w:t>accuracy</w:t>
-      </w:r>
-      <w:proofErr w:type="spellEnd"/>
-      <w:r>
-        <w:rPr>
-          <w:color w:val="000000"/>
-        </w:rPr>
-        <w:t xml:space="preserve"> superior al 96% en ambas implementaciones. La elección del algoritmo de optimización (L-BFGS vs </w:t>
-      </w:r>
-      <w:proofErr w:type="spellStart"/>
-      <w:r>
-        <w:rPr>
-          <w:color w:val="000000"/>
-        </w:rPr>
-        <w:t>Gradient</w:t>
-      </w:r>
-      <w:proofErr w:type="spellEnd"/>
-      <w:r>
-        <w:rPr>
-          <w:color w:val="000000"/>
-        </w:rPr>
-        <w:t xml:space="preserve"> </w:t>
-      </w:r>
-      <w:proofErr w:type="spellStart"/>
-      <w:r>
-        <w:rPr>
-          <w:color w:val="000000"/>
-        </w:rPr>
-        <w:t>Descent</w:t>
-      </w:r>
-      <w:proofErr w:type="spellEnd"/>
-      <w:r>
-        <w:rPr>
-          <w:color w:val="000000"/>
-        </w:rPr>
-        <w:t>) no afecta significativamente la calidad del modelo final, pero sí impacta la velocidad de convergencia.</w:t>
+        <w:t>El proyecto demuestra con evidencia empírica que la Regresión Logística es un clasificador robusto para el problema de clasificación binaria de dígitos MNIST, alcanzando accuracy superior al 96% en ambas implementaciones. La elección del algoritmo de optimización (L-BFGS vs GradientDescent) no afecta significativamente la calidad del modelo final, pero sí impacta la velocidad de convergencia.</w:t>
       </w:r>
     </w:p>
     <w:p>
@@ -6228,35 +4708,7 @@
         <w:rPr>
           <w:color w:val="000000"/>
         </w:rPr>
-        <w:t xml:space="preserve">La implementación C++ con Eigen valida que es posible replicar el comportamiento de bibliotecas de alto nivel desde cero, con equivalencia matemática demostrada. La biblioteca Eigen abstrae eficientemente las operaciones de álgebra lineal sin sacrificar rendimiento, gracias a sus </w:t>
-      </w:r>
-      <w:proofErr w:type="spellStart"/>
-      <w:r>
-        <w:rPr>
-          <w:color w:val="000000"/>
-        </w:rPr>
-        <w:t>expression</w:t>
-      </w:r>
-      <w:proofErr w:type="spellEnd"/>
-      <w:r>
-        <w:rPr>
-          <w:color w:val="000000"/>
-        </w:rPr>
-        <w:t xml:space="preserve"> </w:t>
-      </w:r>
-      <w:proofErr w:type="spellStart"/>
-      <w:r>
-        <w:rPr>
-          <w:color w:val="000000"/>
-        </w:rPr>
-        <w:t>templates</w:t>
-      </w:r>
-      <w:proofErr w:type="spellEnd"/>
-      <w:r>
-        <w:rPr>
-          <w:color w:val="000000"/>
-        </w:rPr>
-        <w:t xml:space="preserve"> y soporte automático de SIMD.</w:t>
+        <w:t>La implementación C++ con Eigen valida que es posible replicar el comportamiento de bibliotecas de alto nivel desde cero, con equivalencia matemática demostrada. La biblioteca Eigen abstrae eficientemente las operaciones de álgebra lineal sin sacrificar rendimiento, gracias a sus expression templates y soporte automático de SIMD.</w:t>
       </w:r>
     </w:p>
     <w:p>
@@ -6268,35 +4720,7 @@
         <w:rPr>
           <w:color w:val="000000"/>
         </w:rPr>
-        <w:t xml:space="preserve">El análisis de memoria revela una ventaja crítica de C++ sobre Python en escenarios de recursos limitados: un factor aproximado de 4.48x de </w:t>
-      </w:r>
-      <w:proofErr w:type="spellStart"/>
-      <w:r>
-        <w:rPr>
-          <w:color w:val="000000"/>
-        </w:rPr>
-        <w:t>reduccion</w:t>
-      </w:r>
-      <w:proofErr w:type="spellEnd"/>
-      <w:r>
-        <w:rPr>
-          <w:color w:val="000000"/>
-        </w:rPr>
-        <w:t xml:space="preserve"> en consumo de memoria favorece la </w:t>
-      </w:r>
-      <w:proofErr w:type="spellStart"/>
-      <w:r>
-        <w:rPr>
-          <w:color w:val="000000"/>
-        </w:rPr>
-        <w:t>implementacion</w:t>
-      </w:r>
-      <w:proofErr w:type="spellEnd"/>
-      <w:r>
-        <w:rPr>
-          <w:color w:val="000000"/>
-        </w:rPr>
-        <w:t xml:space="preserve"> C++ en escenarios de recursos limitados, especialmente si el entrenamiento o la inferencia se adaptan al hardware disponible.</w:t>
+        <w:t>El análisis de memoria revela una ventaja crítica de C++ sobre Python en escenarios de recursos limitados: un factor aproximado de 4.48x de reduccion en consumo de memoria favorece la implementación C++ en escenarios de recursos limitados, especialmente si el entrenamiento o la inferencia se adaptan al hardware disponible.</w:t>
       </w:r>
     </w:p>
     <w:p>
@@ -6312,7 +4736,7 @@
         <w:pStyle w:val="ListParagraph"/>
         <w:numPr>
           <w:ilvl w:val="0"/>
-          <w:numId w:val="2"/>
+          <w:numId w:val="11"/>
         </w:numPr>
         <w:spacing w:after="80"/>
       </w:pPr>
@@ -6333,7 +4757,7 @@
         <w:pStyle w:val="ListParagraph"/>
         <w:numPr>
           <w:ilvl w:val="0"/>
-          <w:numId w:val="2"/>
+          <w:numId w:val="11"/>
         </w:numPr>
         <w:spacing w:after="80"/>
       </w:pPr>
@@ -6346,7 +4770,7 @@
         <w:pStyle w:val="ListParagraph"/>
         <w:numPr>
           <w:ilvl w:val="0"/>
-          <w:numId w:val="2"/>
+          <w:numId w:val="11"/>
         </w:numPr>
         <w:spacing w:after="80"/>
       </w:pPr>
@@ -6359,20 +4783,12 @@
         <w:pStyle w:val="ListParagraph"/>
         <w:numPr>
           <w:ilvl w:val="0"/>
-          <w:numId w:val="2"/>
+          <w:numId w:val="11"/>
         </w:numPr>
         <w:spacing w:after="80"/>
       </w:pPr>
       <w:r>
-        <w:t xml:space="preserve">El análisis de localidad de caché es esencial en implementaciones de bajo nivel: pequeñas decisiones de ordenamiento de accesos a memoria pueden impactar el rendimiento en 2-5× en </w:t>
-      </w:r>
-      <w:proofErr w:type="spellStart"/>
-      <w:r>
-        <w:t>datasets</w:t>
-      </w:r>
-      <w:proofErr w:type="spellEnd"/>
-      <w:r>
-        <w:t xml:space="preserve"> grandes.</w:t>
+        <w:t>El análisis de localidad de caché es esencial en implementaciones de bajo nivel: pequeñas decisiones de ordenamiento de accesos a memoria pueden impactar significativamente el rendimiento en datasets grandes.</w:t>
       </w:r>
     </w:p>
     <w:p/>
@@ -6607,8 +5023,8 @@
         <w:tblLook w:val="04A0" w:firstRow="1" w:lastRow="0" w:firstColumn="1" w:lastColumn="0" w:noHBand="0" w:noVBand="1"/>
       </w:tblPr>
       <w:tblGrid>
-        <w:gridCol w:w="4120"/>
-        <w:gridCol w:w="4906"/>
+        <w:gridCol w:w="5099"/>
+        <w:gridCol w:w="3927"/>
       </w:tblGrid>
       <w:tr>
         <w:tc>
@@ -6699,13 +5115,20 @@
             </w:tcMar>
           </w:tcPr>
           <w:p>
+            <w:r>
+              <w:rPr>
+                <w:sz w:val="20"/>
+                <w:szCs w:val="20"/>
+              </w:rPr>
+              <w:t>notebooks/</w:t>
+            </w:r>
             <w:proofErr w:type="spellStart"/>
             <w:r>
               <w:rPr>
                 <w:sz w:val="20"/>
                 <w:szCs w:val="20"/>
               </w:rPr>
-              <w:t>notebooks/Proyecto_Redes_Neuronales_MNIST.ipynb</w:t>
+              <w:t>Proyecto_Redes_Neuronales_MNIST.ipynb</w:t>
             </w:r>
             <w:proofErr w:type="spellEnd"/>
           </w:p>
@@ -6801,12 +5224,21 @@
             </w:tcMar>
           </w:tcPr>
           <w:p>
-            <w:r>
-              <w:rPr>
-                <w:sz w:val="20"/>
-                <w:szCs w:val="20"/>
-              </w:rPr>
-              <w:t>src/main.cpp</w:t>
+            <w:proofErr w:type="spellStart"/>
+            <w:r>
+              <w:rPr>
+                <w:sz w:val="20"/>
+                <w:szCs w:val="20"/>
+              </w:rPr>
+              <w:t>src</w:t>
+            </w:r>
+            <w:proofErr w:type="spellEnd"/>
+            <w:r>
+              <w:rPr>
+                <w:sz w:val="20"/>
+                <w:szCs w:val="20"/>
+              </w:rPr>
+              <w:t>/main.cpp</w:t>
             </w:r>
           </w:p>
         </w:tc>
@@ -7042,7 +5474,7 @@
         <w:pStyle w:val="ListParagraph"/>
         <w:numPr>
           <w:ilvl w:val="0"/>
-          <w:numId w:val="2"/>
+          <w:numId w:val="12"/>
         </w:numPr>
         <w:spacing w:after="80"/>
       </w:pPr>
@@ -7103,28 +5535,12 @@
         <w:pStyle w:val="ListParagraph"/>
         <w:numPr>
           <w:ilvl w:val="0"/>
-          <w:numId w:val="2"/>
+          <w:numId w:val="12"/>
         </w:numPr>
         <w:spacing w:after="80"/>
       </w:pPr>
       <w:r>
-        <w:t xml:space="preserve">Generar el CSV: ejecutar </w:t>
-      </w:r>
-      <w:proofErr w:type="spellStart"/>
-      <w:r>
-        <w:t>python</w:t>
-      </w:r>
-      <w:proofErr w:type="spellEnd"/>
-      <w:r>
-        <w:t xml:space="preserve"> scripts/export_csv.py desde la </w:t>
-      </w:r>
-      <w:proofErr w:type="spellStart"/>
-      <w:r>
-        <w:t>raiz</w:t>
-      </w:r>
-      <w:proofErr w:type="spellEnd"/>
-      <w:r>
-        <w:t xml:space="preserve"> del proyecto para generar data/mnist_binary_3_8.csv.</w:t>
+        <w:t>Generar el CSV: ejecutar python scripts/export_csv.py desde la raíz del proyecto para generar data/mnist_binary_3_8.csv.</w:t>
       </w:r>
     </w:p>
     <w:p>
@@ -7132,36 +5548,12 @@
         <w:pStyle w:val="ListParagraph"/>
         <w:numPr>
           <w:ilvl w:val="0"/>
-          <w:numId w:val="2"/>
+          <w:numId w:val="12"/>
         </w:numPr>
         <w:spacing w:after="80"/>
       </w:pPr>
       <w:r>
-        <w:t xml:space="preserve">Compilar C++: abrir logistic_regression.pro en Qt </w:t>
-      </w:r>
-      <w:proofErr w:type="spellStart"/>
-      <w:r>
-        <w:t>Creator</w:t>
-      </w:r>
-      <w:proofErr w:type="spellEnd"/>
-      <w:r>
-        <w:t xml:space="preserve">, verificar el </w:t>
-      </w:r>
-      <w:proofErr w:type="spellStart"/>
-      <w:r>
-        <w:t>path</w:t>
-      </w:r>
-      <w:proofErr w:type="spellEnd"/>
-      <w:r>
-        <w:t xml:space="preserve"> de Eigen en </w:t>
-      </w:r>
-      <w:proofErr w:type="spellStart"/>
-      <w:r>
-        <w:t>el</w:t>
-      </w:r>
-      <w:proofErr w:type="spellEnd"/>
-      <w:r>
-        <w:t xml:space="preserve"> .pro, compilar y ejecutar.</w:t>
+        <w:t>Compilar C++: abrir logistic_regression.pro en Qt Creator, verificar el path de Eigen en el .pro, compilar y ejecutar; el proyecto conserva este flujo como opción compatible junto al soporte CMake.</w:t>
       </w:r>
     </w:p>
     <w:p>
@@ -7169,36 +5561,12 @@
         <w:pStyle w:val="ListParagraph"/>
         <w:numPr>
           <w:ilvl w:val="0"/>
-          <w:numId w:val="2"/>
+          <w:numId w:val="12"/>
         </w:numPr>
         <w:spacing w:after="80"/>
       </w:pPr>
       <w:r>
-        <w:t xml:space="preserve">Comparar resultados: los archivos </w:t>
-      </w:r>
-      <w:proofErr w:type="spellStart"/>
-      <w:r>
-        <w:t>results</w:t>
-      </w:r>
-      <w:proofErr w:type="spellEnd"/>
-      <w:r>
-        <w:t xml:space="preserve">/results/resultados_cpp.txt y </w:t>
-      </w:r>
-      <w:proofErr w:type="spellStart"/>
-      <w:r>
-        <w:t>results</w:t>
-      </w:r>
-      <w:proofErr w:type="spellEnd"/>
-      <w:r>
-        <w:t xml:space="preserve">/results/pesos_cpp.csv generados por el binario C++ son </w:t>
-      </w:r>
-      <w:proofErr w:type="spellStart"/>
-      <w:r>
-        <w:t>leidos</w:t>
-      </w:r>
-      <w:proofErr w:type="spellEnd"/>
-      <w:r>
-        <w:t xml:space="preserve"> por el notebook para la celda de comparativa.</w:t>
+        <w:t>Comparar resultados: los archivos results/resultados_cpp.txt y results/pesos_cpp.csv generados por el binario C++ son leídos por el notebook para la celda de comparativa.</w:t>
       </w:r>
     </w:p>
     <w:p/>
@@ -7464,55 +5832,7 @@
                 <w:sz w:val="20"/>
                 <w:szCs w:val="20"/>
               </w:rPr>
-              <w:t xml:space="preserve">Biblioteca C++ </w:t>
-            </w:r>
-            <w:proofErr w:type="spellStart"/>
-            <w:r>
-              <w:rPr>
-                <w:sz w:val="20"/>
-                <w:szCs w:val="20"/>
-              </w:rPr>
-              <w:t>header-only</w:t>
-            </w:r>
-            <w:proofErr w:type="spellEnd"/>
-            <w:r>
-              <w:rPr>
-                <w:sz w:val="20"/>
-                <w:szCs w:val="20"/>
-              </w:rPr>
-              <w:t xml:space="preserve"> para álgebra lineal, optimizada con </w:t>
-            </w:r>
-            <w:proofErr w:type="spellStart"/>
-            <w:r>
-              <w:rPr>
-                <w:sz w:val="20"/>
-                <w:szCs w:val="20"/>
-              </w:rPr>
-              <w:t>expression</w:t>
-            </w:r>
-            <w:proofErr w:type="spellEnd"/>
-            <w:r>
-              <w:rPr>
-                <w:sz w:val="20"/>
-                <w:szCs w:val="20"/>
-              </w:rPr>
-              <w:t xml:space="preserve"> </w:t>
-            </w:r>
-            <w:proofErr w:type="spellStart"/>
-            <w:r>
-              <w:rPr>
-                <w:sz w:val="20"/>
-                <w:szCs w:val="20"/>
-              </w:rPr>
-              <w:t>templates</w:t>
-            </w:r>
-            <w:proofErr w:type="spellEnd"/>
-            <w:r>
-              <w:rPr>
-                <w:sz w:val="20"/>
-                <w:szCs w:val="20"/>
-              </w:rPr>
-              <w:t xml:space="preserve"> y SIMD.</w:t>
+              <w:t>Biblioteca C++ header-only para álgebra lineal, optimizada con expression templates y SIMD.</w:t>
             </w:r>
           </w:p>
         </w:tc>
@@ -7814,6 +6134,7 @@
                 <w:sz w:val="20"/>
                 <w:szCs w:val="20"/>
               </w:rPr>
+              <w:lastRenderedPageBreak/>
               <w:t>F1-Score</w:t>
             </w:r>
           </w:p>
@@ -7881,8 +6202,8 @@
     </w:tbl>
     <w:p/>
     <w:sectPr>
-      <w:headerReference w:type="default" r:id="rId7"/>
-      <w:footerReference w:type="default" r:id="rId8"/>
+      <w:headerReference w:type="default" r:id="rId8"/>
+      <w:footerReference w:type="default" r:id="rId9"/>
       <w:pgSz w:w="11906" w:h="16838"/>
       <w:pgMar w:top="1440" w:right="1440" w:bottom="1440" w:left="1440" w:header="708" w:footer="708" w:gutter="0"/>
       <w:cols w:space="720"/>
@@ -8019,7 +6340,17 @@
         <w:sz w:val="18"/>
         <w:szCs w:val="18"/>
       </w:rPr>
-      <w:t>Universidad Sergio Arboleda  —  Proyecto Final Redes Neuronales  —  2025</w:t>
+      <w:t>Universidad Sergio Arboleda  —  Proyecto Final Redes Neuronales  —  202</w:t>
+    </w:r>
+    <w:r>
+      <w:rPr>
+        <w:i/>
+        <w:iCs/>
+        <w:color w:val="666666"/>
+        <w:sz w:val="18"/>
+        <w:szCs w:val="18"/>
+      </w:rPr>
+      <w:t>6</w:t>
     </w:r>
   </w:p>
 </w:hdr>
@@ -8033,8 +6364,8 @@
     <w:tmpl w:val="0DAE4B02"/>
     <w:lvl w:ilvl="0" w:tplc="11B6E6EC">
       <w:start w:val="1"/>
-      <w:numFmt w:val="bullet"/>
-      <w:lvlText w:val="•"/>
+      <w:numFmt w:val="decimal"/>
+      <w:lvlText w:val="%1."/>
       <w:lvlJc w:val="left"/>
       <w:pPr>
         <w:ind w:left="720" w:hanging="360"/>
@@ -8174,6 +6505,66 @@
     </w:lvlOverride>
   </w:num>
   <w:num w:numId="2" w16cid:durableId="1346597083">
+    <w:abstractNumId w:val="0"/>
+    <w:lvlOverride w:ilvl="0">
+      <w:startOverride w:val="1"/>
+    </w:lvlOverride>
+  </w:num>
+  <w:num w:numId="3" w16cid:durableId="730539293">
+    <w:abstractNumId w:val="0"/>
+    <w:lvlOverride w:ilvl="0">
+      <w:startOverride w:val="1"/>
+    </w:lvlOverride>
+  </w:num>
+  <w:num w:numId="4" w16cid:durableId="1260065447">
+    <w:abstractNumId w:val="0"/>
+    <w:lvlOverride w:ilvl="0">
+      <w:startOverride w:val="1"/>
+    </w:lvlOverride>
+  </w:num>
+  <w:num w:numId="5" w16cid:durableId="1964379263">
+    <w:abstractNumId w:val="0"/>
+    <w:lvlOverride w:ilvl="0">
+      <w:startOverride w:val="1"/>
+    </w:lvlOverride>
+  </w:num>
+  <w:num w:numId="6" w16cid:durableId="815226283">
+    <w:abstractNumId w:val="0"/>
+    <w:lvlOverride w:ilvl="0">
+      <w:startOverride w:val="1"/>
+    </w:lvlOverride>
+  </w:num>
+  <w:num w:numId="7" w16cid:durableId="698891668">
+    <w:abstractNumId w:val="0"/>
+    <w:lvlOverride w:ilvl="0">
+      <w:startOverride w:val="1"/>
+    </w:lvlOverride>
+  </w:num>
+  <w:num w:numId="8" w16cid:durableId="2061392247">
+    <w:abstractNumId w:val="0"/>
+    <w:lvlOverride w:ilvl="0">
+      <w:startOverride w:val="1"/>
+    </w:lvlOverride>
+  </w:num>
+  <w:num w:numId="9" w16cid:durableId="327907709">
+    <w:abstractNumId w:val="0"/>
+    <w:lvlOverride w:ilvl="0">
+      <w:startOverride w:val="1"/>
+    </w:lvlOverride>
+  </w:num>
+  <w:num w:numId="10" w16cid:durableId="576784741">
+    <w:abstractNumId w:val="0"/>
+    <w:lvlOverride w:ilvl="0">
+      <w:startOverride w:val="1"/>
+    </w:lvlOverride>
+  </w:num>
+  <w:num w:numId="11" w16cid:durableId="1021321227">
+    <w:abstractNumId w:val="0"/>
+    <w:lvlOverride w:ilvl="0">
+      <w:startOverride w:val="1"/>
+    </w:lvlOverride>
+  </w:num>
+  <w:num w:numId="12" w16cid:durableId="40834612">
     <w:abstractNumId w:val="0"/>
     <w:lvlOverride w:ilvl="0">
       <w:startOverride w:val="1"/>
@@ -8787,6 +7178,48 @@
       <w:szCs w:val="20"/>
     </w:rPr>
   </w:style>
+  <w:style w:type="paragraph" w:styleId="Header">
+    <w:name w:val="header"/>
+    <w:basedOn w:val="Normal"/>
+    <w:link w:val="HeaderChar"/>
+    <w:uiPriority w:val="99"/>
+    <w:unhideWhenUsed/>
+    <w:rsid w:val="00177341"/>
+    <w:pPr>
+      <w:tabs>
+        <w:tab w:val="center" w:pos="4680"/>
+        <w:tab w:val="right" w:pos="9360"/>
+      </w:tabs>
+    </w:pPr>
+  </w:style>
+  <w:style w:type="character" w:customStyle="1" w:styleId="HeaderChar">
+    <w:name w:val="Header Char"/>
+    <w:basedOn w:val="DefaultParagraphFont"/>
+    <w:link w:val="Header"/>
+    <w:uiPriority w:val="99"/>
+    <w:rsid w:val="00177341"/>
+  </w:style>
+  <w:style w:type="paragraph" w:styleId="Footer">
+    <w:name w:val="footer"/>
+    <w:basedOn w:val="Normal"/>
+    <w:link w:val="FooterChar"/>
+    <w:uiPriority w:val="99"/>
+    <w:unhideWhenUsed/>
+    <w:rsid w:val="00177341"/>
+    <w:pPr>
+      <w:tabs>
+        <w:tab w:val="center" w:pos="4680"/>
+        <w:tab w:val="right" w:pos="9360"/>
+      </w:tabs>
+    </w:pPr>
+  </w:style>
+  <w:style w:type="character" w:customStyle="1" w:styleId="FooterChar">
+    <w:name w:val="Footer Char"/>
+    <w:basedOn w:val="DefaultParagraphFont"/>
+    <w:link w:val="Footer"/>
+    <w:uiPriority w:val="99"/>
+    <w:rsid w:val="00177341"/>
+  </w:style>
 </w:styles>
 </file>
 
@@ -9103,4 +7536,16 @@
     </a:ext>
   </a:extLst>
 </a:theme>
+</file>
+
+<file path=customXml/item1.xml><?xml version="1.0" encoding="utf-8"?>
+<b:Sources xmlns:b="http://schemas.openxmlformats.org/officeDocument/2006/bibliography" xmlns="http://schemas.openxmlformats.org/officeDocument/2006/bibliography" SelectedStyle="\APASixthEditionOfficeOnline.xsl" StyleName="APA" Version="6"/>
+</file>
+
+<file path=customXml/itemProps1.xml><?xml version="1.0" encoding="utf-8"?>
+<ds:datastoreItem xmlns:ds="http://schemas.openxmlformats.org/officeDocument/2006/customXml" ds:itemID="{E6C47213-5BA0-4EAD-A9A4-609084B5F46C}">
+  <ds:schemaRefs>
+    <ds:schemaRef ds:uri="http://schemas.openxmlformats.org/officeDocument/2006/bibliography"/>
+  </ds:schemaRefs>
+</ds:datastoreItem>
 </file>
</xml_diff>